<commit_message>
fix: README cleanup, PPT script path, speaker notes docx
</commit_message>
<xml_diff>
--- a/assets/speaker-notes.docx
+++ b/assets/speaker-notes.docx
@@ -13,324 +13,104 @@
     </w:p>
     <w:p>
       <w:r>
-        <w:t>5 分钟演示 + 3 分钟 Q&amp;A。每页标注时间分配和关键话术。</w:t>
+        <w:t>5 分钟演示 + 3 分钟 Q&amp;A。保持嘴上不停，不用和 PPT 逐页对应。</w:t>
       </w:r>
     </w:p>
     <w:p/>
     <w:p>
       <w:pPr>
-        <w:pStyle w:val="Heading2"/>
+        <w:pStyle w:val="Heading1"/>
       </w:pPr>
       <w:r>
-        <w:t>Slide 1: 封面（15秒）</w:t>
+        <w:t>主讲（2 分钟，自然过渡）</w:t>
       </w:r>
     </w:p>
     <w:p>
+      <w:pPr>
+        <w:spacing w:after="240"/>
+      </w:pPr>
       <w:r>
         <w:rPr>
-          <w:b/>
+          <w:sz w:val="28"/>
         </w:rPr>
-        <w:t>说什么：</w:t>
-      </w:r>
-      <w:r>
-        <w:t>大家好，我是 QueryForge 的开发者。QueryForge 是一个 AI 数据分析智能体，让业务团队用自然语言直接提问，不用等分析师排期。我们用 Kaggle 上 Olist 巴西电商的真实数据——99,441 笔订单——做了完整验证。</w:t>
+        <w:t>大家好，我是 QueryForge 的开发者。</w:t>
       </w:r>
     </w:p>
     <w:p>
+      <w:pPr>
+        <w:spacing w:after="240"/>
+      </w:pPr>
       <w:r>
         <w:rPr>
-          <w:b/>
-          <w:color w:val="CF222E"/>
+          <w:sz w:val="28"/>
         </w:rPr>
-        <w:t>不要说：</w:t>
-      </w:r>
-      <w:r>
-        <w:t>不要提用了什么模型、什么框架。评委不关心技术栈，关心产品能不能用。</w:t>
-      </w:r>
-    </w:p>
-    <w:p/>
-    <w:p>
-      <w:pPr>
-        <w:pStyle w:val="Heading2"/>
-      </w:pPr>
-      <w:r>
-        <w:t>Slide 2: 痛点（30秒）</w:t>
+        <w:t>数据分析师每天 80% 的时间在做同一件事——帮业务同事拉数据。运营问华东卖了多少，排队；市场问哪个品类增长最快，排期；老板问为什么下滑，加急。同一个指标不同部门问十遍改十遍。</w:t>
       </w:r>
     </w:p>
     <w:p>
+      <w:pPr>
+        <w:spacing w:after="240"/>
+      </w:pPr>
       <w:r>
         <w:rPr>
-          <w:b/>
+          <w:sz w:val="28"/>
         </w:rPr>
-        <w:t>说什么：</w:t>
-      </w:r>
-      <w:r>
-        <w:t>数据分析师的日常是这样的：运营问'华东上个月卖了多少'，得找分析师排队；市场问'哪个品类增长最快'，得排期等报表；老板问'为什么这个月下滑'，加急再加急。同一个指标，不同部门问 10 遍改 10 遍。分析师 80% 的时间在重复拉数，真正有价值的深度分析被挤占。</w:t>
+        <w:t>QueryForge 让分析师定义一次指标口径，业务团队永久使用。用自然语言提问，系统自动理解意图、生成 SQL、查询数据、返回图表和分析报告。</w:t>
       </w:r>
     </w:p>
     <w:p>
+      <w:pPr>
+        <w:spacing w:after="240"/>
+      </w:pPr>
       <w:r>
         <w:rPr>
-          <w:b/>
-          <w:color w:val="0969DA"/>
+          <w:sz w:val="28"/>
         </w:rPr>
-        <w:t>关键句：</w:t>
-      </w:r>
-      <w:r>
-        <w:t>痛点不是没有数据，是数据到不了需要的人手里。</w:t>
-      </w:r>
-    </w:p>
-    <w:p/>
-    <w:p>
-      <w:pPr>
-        <w:pStyle w:val="Heading2"/>
-      </w:pPr>
-      <w:r>
-        <w:t>Slide 3: 方案（30秒）</w:t>
+        <w:t>我们不是用模拟数据做的。数据源是 Kaggle 上 Olist 巴西电商平台的真实交易数据——99,441 笔真实订单，96,096 个真实用户，74 个品类，覆盖巴西五个地区，2016 到 2018 年的完整时间序列。所有查询、SQL 执行、图表渲染都是真实链路，评委可以随时验证。</w:t>
       </w:r>
     </w:p>
     <w:p>
+      <w:pPr>
+        <w:spacing w:after="240"/>
+      </w:pPr>
       <w:r>
         <w:rPr>
-          <w:b/>
+          <w:sz w:val="28"/>
         </w:rPr>
-        <w:t>说什么：</w:t>
-      </w:r>
-      <w:r>
-        <w:t>我们的解法是：分析师定义一次指标口径，业务团队永久使用。分析师把领域知识沉淀为可复用的指标资产——比如'活跃用户'的定义、'营收'的计算方式。之后业务人员用自然语言提问，系统自动理解意图、匹配指标、查询数据、生成图表。</w:t>
+        <w:t>技术上有三层设计。第一层，受控语义层——不靠大模型猜表名，而是通过分析师定义的指标来翻译业务语言。第二层，验证式 Agent 循环——生成 SQL 之后先做语法验证，再只读执行，然后分析结果。如果出错自动修正重试。第三层，企业数据平面——大模型只看到表名和列名，永远不接触原始数据。SQL 用语法树做安全校验，只允许 SELECT 查询。同样的架构模式，Snowflake Cortex 和 Databricks AI/BI 都在用。</w:t>
       </w:r>
     </w:p>
     <w:p>
+      <w:pPr>
+        <w:spacing w:after="240"/>
+      </w:pPr>
       <w:r>
         <w:rPr>
-          <w:b/>
-          <w:color w:val="0969DA"/>
+          <w:sz w:val="28"/>
         </w:rPr>
-        <w:t>关键句：</w:t>
-      </w:r>
-      <w:r>
-        <w:t>从'提需求等三天'到'自己问自己看'。不是每次重新理解，而是一次定义永久可用。</w:t>
-      </w:r>
-    </w:p>
-    <w:p/>
-    <w:p>
-      <w:pPr>
-        <w:pStyle w:val="Heading2"/>
-      </w:pPr>
-      <w:r>
-        <w:t>Slide 4: 产品能力（30秒）</w:t>
+        <w:t>差异化在哪？市面上的 Text-to-SQL 工具——Vanna.ai、BlazeSQL、Wren AI——都是让 AI 直接写 SQL。我们的不同是：分析师预设指标库，业务人员一键选择，口径全公司统一。而且查询出错时系统会自动诊断修正，用户看到完整的修正过程。这不是一个套壳 ChatGPT。</w:t>
       </w:r>
     </w:p>
     <w:p>
+      <w:pPr>
+        <w:spacing w:after="240"/>
+      </w:pPr>
       <w:r>
         <w:rPr>
-          <w:b/>
+          <w:sz w:val="28"/>
         </w:rPr>
-        <w:t>说什么：</w:t>
-      </w:r>
-      <w:r>
-        <w:t>产品有四个核心能力：第一，自然语言取数加可视化，业务人员问什么就出什么图表；第二，归因和建议，系统不只给数字，还会分析原因、给出行动建议；第三，智能纠错，SQL 出错时自动诊断修正重试，用户不会被错误卡住；第四，分析师预设指标库，确保全公司口径统一。</w:t>
+        <w:t>一个产品两方受益。分析师从拉数的变成定标准的，业务团队从等三天变成自己问自己看。从 Demo 到企业版的路径也清楚——一到两周换 PostgreSQL 加用户认证，一到两个月加 SSO 和行级安全。</w:t>
       </w:r>
     </w:p>
     <w:p>
+      <w:pPr>
+        <w:spacing w:after="240"/>
+      </w:pPr>
       <w:r>
         <w:rPr>
-          <w:b/>
+          <w:sz w:val="28"/>
         </w:rPr>
-        <w:t>注意：</w:t>
-      </w:r>
-      <w:r>
-        <w:t>快速过，不要在这里展开。演示环节会现场展示。</w:t>
-      </w:r>
-    </w:p>
-    <w:p/>
-    <w:p>
-      <w:pPr>
-        <w:pStyle w:val="Heading2"/>
-      </w:pPr>
-      <w:r>
-        <w:t>Slide 5: 真实数据（20秒）</w:t>
-      </w:r>
-    </w:p>
-    <w:p>
-      <w:r>
-        <w:rPr>
-          <w:b/>
-        </w:rPr>
-        <w:t>说什么：</w:t>
-      </w:r>
-      <w:r>
-        <w:t>我们没有用模拟数据。这个项目基于 Kaggle 上 Olist 巴西电商平台的真实交易数据集——99,441 笔真实订单，96,096 个真实用户，74 个商品品类，覆盖巴西 5 大地区，2016 到 2018 年的完整时间序列。所有查询、SQL 执行、图表渲染都是真实链路。</w:t>
-      </w:r>
-    </w:p>
-    <w:p>
-      <w:r>
-        <w:rPr>
-          <w:b/>
-          <w:color w:val="0969DA"/>
-        </w:rPr>
-        <w:t>关键句：</w:t>
-      </w:r>
-      <w:r>
-        <w:t>评委可以随时验证——数据集是公开的，查询是可复现的。</w:t>
-      </w:r>
-    </w:p>
-    <w:p/>
-    <w:p>
-      <w:pPr>
-        <w:pStyle w:val="Heading2"/>
-      </w:pPr>
-      <w:r>
-        <w:t>Slide 6: 三层架构（40秒）</w:t>
-      </w:r>
-    </w:p>
-    <w:p>
-      <w:r>
-        <w:rPr>
-          <w:b/>
-        </w:rPr>
-        <w:t>说什么：</w:t>
-      </w:r>
-      <w:r>
-        <w:t>技术上我们做了三层设计。第一层是受控语义层：不靠大模型猜表名，而是通过分析师定义的指标来翻译业务语言，防止口径不一致。第二层是验证式 Agent 循环：生成 SQL 之后，先做语法验证，再只读执行，然后分析结果，最后才产出可视化和分析报告。如果出错，自动修正重试。第三层是企业数据平面：大模型只看到表名和列名，永远不接触原始数据；数据库是只读连接；SQL 用语法树做安全校验。</w:t>
-      </w:r>
-    </w:p>
-    <w:p>
-      <w:r>
-        <w:rPr>
-          <w:b/>
-          <w:color w:val="0969DA"/>
-        </w:rPr>
-        <w:t>关键句：</w:t>
-      </w:r>
-      <w:r>
-        <w:t>这不是一个套了壳的 ChatGPT。每一层都有明确的安全边界。</w:t>
-      </w:r>
-    </w:p>
-    <w:p/>
-    <w:p>
-      <w:pPr>
-        <w:pStyle w:val="Heading2"/>
-      </w:pPr>
-      <w:r>
-        <w:t>Slide 7: 数据合规（30秒）</w:t>
-      </w:r>
-    </w:p>
-    <w:p>
-      <w:r>
-        <w:rPr>
-          <w:b/>
-        </w:rPr>
-        <w:t>说什么：</w:t>
-      </w:r>
-      <w:r>
-        <w:t>如果这是一个真实产品，企业买家最关心的是数据安全。我们的方案是：大模型只看 Schema，不看数据——这是核心设计。SQL 用语法树解析，只允许 SELECT 查询，杜绝写入操作。数据库层面配置只读连接。自动加 LIMIT 防止全表扫描。生产路线图还包括行级安全、PII 脱敏、审计日志、SSO 集成。</w:t>
-      </w:r>
-    </w:p>
-    <w:p>
-      <w:r>
-        <w:rPr>
-          <w:b/>
-          <w:color w:val="0969DA"/>
-        </w:rPr>
-        <w:t>关键句：</w:t>
-      </w:r>
-      <w:r>
-        <w:t>同样的架构模式，Snowflake Cortex 和 Databricks AI/BI 都在用。</w:t>
-      </w:r>
-    </w:p>
-    <w:p/>
-    <w:p>
-      <w:pPr>
-        <w:pStyle w:val="Heading2"/>
-      </w:pPr>
-      <w:r>
-        <w:t>Slide 8: 生产路径（20秒）</w:t>
-      </w:r>
-    </w:p>
-    <w:p>
-      <w:r>
-        <w:rPr>
-          <w:b/>
-        </w:rPr>
-        <w:t>说什么：</w:t>
-      </w:r>
-      <w:r>
-        <w:t>从 Demo 到产品的路径很清楚。Phase 1 是可售 MVP，一到两周：换 PostgreSQL、加用户认证、建语义层。Phase 2 是企业试用，一到两个月：SSO 集成、行级安全、多数据源。Phase 3 是规模化，三到六个月：支持 Snowflake、BigQuery、ClickHouse。每查询成本大约 0.003 美元。</w:t>
-      </w:r>
-    </w:p>
-    <w:p>
-      <w:r>
-        <w:rPr>
-          <w:b/>
-        </w:rPr>
-        <w:t>注意：</w:t>
-      </w:r>
-      <w:r>
-        <w:t>快速过，证明你想过商业化路径就行。</w:t>
-      </w:r>
-    </w:p>
-    <w:p/>
-    <w:p>
-      <w:pPr>
-        <w:pStyle w:val="Heading2"/>
-      </w:pPr>
-      <w:r>
-        <w:t>Slide 9: 双重价值（20秒）</w:t>
-      </w:r>
-    </w:p>
-    <w:p>
-      <w:r>
-        <w:rPr>
-          <w:b/>
-        </w:rPr>
-        <w:t>说什么：</w:t>
-      </w:r>
-      <w:r>
-        <w:t>一个产品两方受益。数据分析师减少 80% 重复取数工作，专注于指标定义和数据治理——从'拉数的'变成'定标准的'。业务团队随时提问不用排队——一个需求从 3 天缩短到 10 秒。</w:t>
-      </w:r>
-    </w:p>
-    <w:p>
-      <w:r>
-        <w:rPr>
-          <w:b/>
-          <w:color w:val="0969DA"/>
-        </w:rPr>
-        <w:t>关键句：</w:t>
-      </w:r>
-      <w:r>
-        <w:t>分析师被解放，业务被赋能。</w:t>
-      </w:r>
-    </w:p>
-    <w:p/>
-    <w:p>
-      <w:pPr>
-        <w:pStyle w:val="Heading2"/>
-      </w:pPr>
-      <w:r>
-        <w:t>Slide 10: 结束（15秒）</w:t>
-      </w:r>
-    </w:p>
-    <w:p>
-      <w:r>
-        <w:rPr>
-          <w:b/>
-        </w:rPr>
-        <w:t>说什么：</w:t>
-      </w:r>
-      <w:r>
-        <w:t>QueryForge 不是让 AI 替代分析师，而是让分析师的能力通过 AI 放大 10 倍。我们定位是受控的对话式分析层。大家可以扫二维码体验在线演示，GitHub 仓库完全开源。谢谢。</w:t>
-      </w:r>
-    </w:p>
-    <w:p>
-      <w:r>
-        <w:rPr>
-          <w:b/>
-        </w:rPr>
-        <w:t>注意：</w:t>
-      </w:r>
-      <w:r>
-        <w:t>指向二维码让评委扫。如果时间允许，可以现场打开演示页面。</w:t>
+        <w:t>大家可以扫二维码体验在线演示，GitHub 完全开源。谢谢。</w:t>
       </w:r>
     </w:p>
     <w:p/>
@@ -346,69 +126,68 @@
       <w:r>
         <w:rPr>
           <w:b/>
+          <w:sz w:val="26"/>
         </w:rPr>
-        <w:t>Q: 和 ChatGPT + 数据库有什么区别？</w:t>
+        <w:t>Q: 和 ChatGPT 有什么区别？</w:t>
+      </w:r>
+    </w:p>
+    <w:p>
+      <w:pPr>
+        <w:spacing w:after="200"/>
+      </w:pPr>
+      <w:r>
+        <w:t>A: ChatGPT 需要用户自己写 SQL 或者给它数据库权限。我们是分析师定义指标，业务人员只用自然语言问。而且大模型永远不接触原始数据——它只看表名。</w:t>
       </w:r>
     </w:p>
     <w:p>
       <w:r>
-        <w:t>A: ChatGPT 需要用户自己写 SQL 或者给它数据库权限。我们是分析师定义指标，业务人员只用自然语言问，系统自动匹配。而且大模型永远不接触原始数据——它只看表名。</w:t>
-      </w:r>
-    </w:p>
-    <w:p/>
-    <w:p>
-      <w:r>
         <w:rPr>
           <w:b/>
-        </w:rPr>
-        <w:t>Q: 和 Vanna.ai 有什么区别？</w:t>
-      </w:r>
-    </w:p>
-    <w:p>
-      <w:r>
-        <w:t>A: Vanna 是开发者工具，需要训练数据和技术背景。我们的指标库让分析师一键定义，业务人员直接用。而且我们有自纠正循环——SQL 出错会自动修正，Vanna 不会。</w:t>
-      </w:r>
-    </w:p>
-    <w:p/>
-    <w:p>
-      <w:r>
-        <w:rPr>
-          <w:b/>
+          <w:sz w:val="26"/>
         </w:rPr>
         <w:t>Q: 数据是假的吧？</w:t>
       </w:r>
     </w:p>
     <w:p>
+      <w:pPr>
+        <w:spacing w:after="200"/>
+      </w:pPr>
       <w:r>
-        <w:t>A: 不是。这是 Kaggle 上 Olist 巴西电商平台的公开数据集，99,441 笔真实交易。评委可以去 Kaggle 验证。</w:t>
+        <w:t>A: 不是。Kaggle 上 Olist 巴西电商公开数据集，99,441 笔真实交易。评委可以去 Kaggle 验证。</w:t>
       </w:r>
     </w:p>
-    <w:p/>
     <w:p>
       <w:r>
         <w:rPr>
           <w:b/>
+          <w:sz w:val="26"/>
         </w:rPr>
         <w:t>Q: 大模型幻觉怎么办？</w:t>
       </w:r>
     </w:p>
     <w:p>
+      <w:pPr>
+        <w:spacing w:after="200"/>
+      </w:pPr>
       <w:r>
-        <w:t>A: 三层防御。第一，大模型只看 Schema 不看数据，减少幻觉素材。第二，SQL 经过语法树验证，只允许 SELECT。第三，自纠正循环——如果 SQL 执行失败，系统会把错误信息反馈给大模型让它修正。</w:t>
+        <w:t>A: 三层防御。大模型只看 Schema 不看数据。SQL 语法树验证只允许 SELECT。自纠正循环——出错自动修正重试。</w:t>
       </w:r>
     </w:p>
-    <w:p/>
     <w:p>
       <w:r>
         <w:rPr>
           <w:b/>
+          <w:sz w:val="26"/>
         </w:rPr>
         <w:t>Q: 怎么商业化？</w:t>
       </w:r>
     </w:p>
     <w:p>
+      <w:pPr>
+        <w:spacing w:after="200"/>
+      </w:pPr>
       <w:r>
-        <w:t>A: Phase 1 是 SaaS 模式，按查询量收费。Phase 2 是企业版，支持私有部署、SSO、审计日志。核心壁垒是语义层——分析师定义的指标越多，切换成本越高。</w:t>
+        <w:t>A: SaaS 按查询量收费。企业版支持私有部署、SSO、审计日志。核心壁垒是语义层——指标定义越多切换成本越高。</w:t>
       </w:r>
     </w:p>
     <w:p/>
@@ -417,37 +196,55 @@
         <w:pStyle w:val="Heading1"/>
       </w:pPr>
       <w:r>
-        <w:t>演示流程（现场 Live Demo）</w:t>
+        <w:t>演示流程</w:t>
       </w:r>
     </w:p>
     <w:p>
+      <w:pPr>
+        <w:pStyle w:val="ListNumber"/>
+      </w:pPr>
       <w:r>
-        <w:t>1. 打开页面，先看 KPI 卡片（3 秒）</w:t>
+        <w:t>打开页面，看 KPI 卡片（3 秒）</w:t>
       </w:r>
     </w:p>
     <w:p>
+      <w:pPr>
+        <w:pStyle w:val="ListNumber"/>
+      </w:pPr>
       <w:r>
-        <w:t>2. 点击「各地区客单价差异分析」预设问题（等待 3-5 秒出图表）</w:t>
+        <w:t>点「各地区客单价差异分析」→ 出图表 + 分析报告</w:t>
       </w:r>
     </w:p>
     <w:p>
+      <w:pPr>
+        <w:pStyle w:val="ListNumber"/>
+      </w:pPr>
       <w:r>
-        <w:t>3. 展示分析师级文字分析（数据结论 + 趋势 + 建议）</w:t>
+        <w:t>手输一个问题：「华东和华南的品类偏好有什么差异？」</w:t>
       </w:r>
     </w:p>
     <w:p>
+      <w:pPr>
+        <w:pStyle w:val="ListNumber"/>
+      </w:pPr>
       <w:r>
-        <w:t>4. 手动输入一个问题：「华东和华南的品类偏好有什么差异？」（展示自然语言理解）</w:t>
+        <w:t>展示自纠正：问一个可能出错的问题</w:t>
       </w:r>
     </w:p>
     <w:p>
+      <w:pPr>
+        <w:pStyle w:val="ListNumber"/>
+      </w:pPr>
       <w:r>
-        <w:t>5. 展示自纠正：故意问一个可能出错的问题，看系统自动修正</w:t>
+        <w:t>切到看板页面，展示实时图表</w:t>
       </w:r>
     </w:p>
     <w:p>
+      <w:pPr>
+        <w:pStyle w:val="ListNumber"/>
+      </w:pPr>
       <w:r>
-        <w:t>6. 切换到看板页面，展示实时数据图表</w:t>
+        <w:t>指向二维码，说谢谢</w:t>
       </w:r>
     </w:p>
     <w:p/>

</xml_diff>

<commit_message>
feat: polish QueryForge demo and public release
</commit_message>
<xml_diff>
--- a/assets/speaker-notes.docx
+++ b/assets/speaker-notes.docx
@@ -4,264 +4,332 @@
   <w:body>
     <w:p>
       <w:pPr>
-        <w:pStyle w:val="Title"/>
         <w:jc w:val="center"/>
       </w:pPr>
       <w:r>
-        <w:t>QueryForge 路演讲稿</w:t>
+        <w:rPr>
+          <w:rFonts w:ascii="Arial" w:hAnsi="Arial" w:eastAsia="Microsoft YaHei"/>
+          <w:b/>
+          <w:sz w:val="36"/>
+        </w:rPr>
+        <w:t>QueryForge 路演讲稿（双人版）</w:t>
       </w:r>
     </w:p>
     <w:p>
+      <w:pPr>
+        <w:jc w:val="center"/>
+      </w:pPr>
       <w:r>
-        <w:t>5 分钟演示 + 3 分钟 Q&amp;A。保持嘴上不停，不用和 PPT 逐页对应。</w:t>
+        <w:rPr>
+          <w:rFonts w:ascii="Arial" w:hAnsi="Arial" w:eastAsia="Microsoft YaHei"/>
+        </w:rPr>
+        <w:t>分工：Mavis 负责商业叙事，Eric 负责开发与技术可信度。5 分钟演示 + 3 分钟 Q&amp;A，可按现场时间删减。</w:t>
       </w:r>
     </w:p>
-    <w:p/>
     <w:p>
       <w:pPr>
         <w:pStyle w:val="Heading1"/>
       </w:pPr>
       <w:r>
-        <w:t>主讲（2 分钟，自然过渡）</w:t>
+        <w:rPr>
+          <w:rFonts w:ascii="Arial" w:hAnsi="Arial" w:eastAsia="Microsoft YaHei"/>
+        </w:rPr>
+        <w:t>Mavis｜商业叙述（约 2 分钟）</w:t>
       </w:r>
     </w:p>
     <w:p>
       <w:pPr>
-        <w:spacing w:after="240"/>
+        <w:spacing w:after="120" w:line="276" w:lineRule="auto"/>
       </w:pPr>
       <w:r>
         <w:rPr>
-          <w:sz w:val="28"/>
+          <w:rFonts w:ascii="Arial" w:hAnsi="Arial" w:eastAsia="Microsoft YaHei"/>
         </w:rPr>
-        <w:t>大家好，我是 QueryForge 的开发者。</w:t>
+        <w:t>大家好，我们做的是 QueryForge，一个受治理的自助式商业分析层。它不是再做一张漂亮看板，而是解决企业里很常见的矛盾：业务要速度，数据团队要口径、权限和审计。</w:t>
       </w:r>
     </w:p>
     <w:p>
       <w:pPr>
-        <w:spacing w:after="240"/>
+        <w:spacing w:after="120" w:line="276" w:lineRule="auto"/>
       </w:pPr>
       <w:r>
         <w:rPr>
-          <w:sz w:val="28"/>
+          <w:rFonts w:ascii="Arial" w:hAnsi="Arial" w:eastAsia="Microsoft YaHei"/>
         </w:rPr>
-        <w:t>数据分析师每天 80% 的时间在做同一件事——帮业务同事拉数据。运营问华东卖了多少，排队；市场问哪个品类增长最快，排期；老板问为什么下滑，加急。同一个指标不同部门问十遍改十遍。</w:t>
+        <w:t>Gartner 对数据分析的定义很直接：管理数据、分析数据，是为了改进决策、业务流程和结果。Tableau 和 IBM 讲现代 BI，也都强调 self-service analytics、governed data 和 speed to insight。QueryForge 对准的就是这块：让业务可以追问，同时让数据团队保留治理边界。</w:t>
       </w:r>
     </w:p>
     <w:p>
       <w:pPr>
-        <w:spacing w:after="240"/>
+        <w:spacing w:after="120" w:line="276" w:lineRule="auto"/>
       </w:pPr>
       <w:r>
         <w:rPr>
-          <w:sz w:val="28"/>
+          <w:rFonts w:ascii="Arial" w:hAnsi="Arial" w:eastAsia="Microsoft YaHei"/>
         </w:rPr>
-        <w:t>QueryForge 让分析师定义一次指标口径，业务团队永久使用。用自然语言提问，系统自动理解意图、生成 SQL、查询数据、返回图表和分析报告。</w:t>
+        <w:t>今天使用的是公开真实数据。我们接入 Kaggle 上的 Olist Brazilian E-Commerce Public Dataset，约 10 万笔巴西电商订单，包含订单状态、价格、支付、物流、客户位置、商品属性和评价。这个数据足够接近真实业务问题：区域、品类、支付方式、复购、物流和评价可以串起来看。</w:t>
       </w:r>
     </w:p>
     <w:p>
       <w:pPr>
-        <w:spacing w:after="240"/>
+        <w:spacing w:after="120" w:line="276" w:lineRule="auto"/>
       </w:pPr>
       <w:r>
         <w:rPr>
-          <w:sz w:val="28"/>
+          <w:rFonts w:ascii="Arial" w:hAnsi="Arial" w:eastAsia="Microsoft YaHei"/>
         </w:rPr>
-        <w:t>我们不是用模拟数据做的。数据源是 Kaggle 上 Olist 巴西电商平台的真实交易数据——99,441 笔真实订单，96,096 个真实用户，74 个品类，覆盖巴西五个地区，2016 到 2018 年的完整时间序列。所有查询、SQL 执行、图表渲染都是真实链路，评委可以随时验证。</w:t>
+        <w:t>商业上，QueryForge 的用户不是单一角色。数据团队关心的是减少重复取数、统一指标口径、降低审计成本；运营和市场关心的是不用排队等临时报表，可以围绕同一份可信数据连续追问。商业模式也很清楚：团队席位、查询量、私有部署和企业数据源连接。</w:t>
       </w:r>
     </w:p>
-    <w:p>
-      <w:pPr>
-        <w:spacing w:after="240"/>
-      </w:pPr>
-      <w:r>
-        <w:rPr>
-          <w:sz w:val="28"/>
-        </w:rPr>
-        <w:t>技术上有三层设计。第一层，受控语义层——不靠大模型猜表名，而是通过分析师定义的指标来翻译业务语言。第二层，验证式 Agent 循环——生成 SQL 之后先做语法验证，再只读执行，然后分析结果。如果出错自动修正重试。第三层，企业数据平面——大模型只看到表名和列名，永远不接触原始数据。SQL 用语法树做安全校验，只允许 SELECT 查询。同样的架构模式，Snowflake Cortex 和 Databricks AI/BI 都在用。</w:t>
-      </w:r>
-    </w:p>
-    <w:p>
-      <w:pPr>
-        <w:spacing w:after="240"/>
-      </w:pPr>
-      <w:r>
-        <w:rPr>
-          <w:sz w:val="28"/>
-        </w:rPr>
-        <w:t>差异化在哪？市面上的 Text-to-SQL 工具——Vanna.ai、BlazeSQL、Wren AI——都是让 AI 直接写 SQL。我们的不同是：分析师预设指标库，业务人员一键选择，口径全公司统一。而且查询出错时系统会自动诊断修正，用户看到完整的修正过程。这不是一个套壳 ChatGPT。</w:t>
-      </w:r>
-    </w:p>
-    <w:p>
-      <w:pPr>
-        <w:spacing w:after="240"/>
-      </w:pPr>
-      <w:r>
-        <w:rPr>
-          <w:sz w:val="28"/>
-        </w:rPr>
-        <w:t>一个产品两方受益。分析师从拉数的变成定标准的，业务团队从等三天变成自己问自己看。从 Demo 到企业版的路径也清楚——一到两周换 PostgreSQL 加用户认证，一到两个月加 SSO 和行级安全。</w:t>
-      </w:r>
-    </w:p>
-    <w:p>
-      <w:pPr>
-        <w:spacing w:after="240"/>
-      </w:pPr>
-      <w:r>
-        <w:rPr>
-          <w:sz w:val="28"/>
-        </w:rPr>
-        <w:t>大家可以扫二维码体验在线演示，GitHub 完全开源。谢谢。</w:t>
-      </w:r>
-    </w:p>
-    <w:p/>
     <w:p>
       <w:pPr>
         <w:pStyle w:val="Heading1"/>
       </w:pPr>
       <w:r>
+        <w:rPr>
+          <w:rFonts w:ascii="Arial" w:hAnsi="Arial" w:eastAsia="Microsoft YaHei"/>
+        </w:rPr>
+        <w:t>Eric｜开发阐述（约 2 分钟）</w:t>
+      </w:r>
+    </w:p>
+    <w:p>
+      <w:pPr>
+        <w:spacing w:after="120" w:line="276" w:lineRule="auto"/>
+      </w:pPr>
+      <w:r>
+        <w:rPr>
+          <w:rFonts w:ascii="Arial" w:hAnsi="Arial" w:eastAsia="Microsoft YaHei"/>
+        </w:rPr>
+        <w:t>我讲技术实现。这个产品的关键不是让大模型直接猜 SQL，而是三层结构：统一语义层、验证式 Agent 循环、执行与治理边界。</w:t>
+      </w:r>
+    </w:p>
+    <w:p>
+      <w:pPr>
+        <w:spacing w:after="120" w:line="276" w:lineRule="auto"/>
+      </w:pPr>
+      <w:r>
+        <w:rPr>
+          <w:rFonts w:ascii="Arial" w:hAnsi="Arial" w:eastAsia="Microsoft YaHei"/>
+        </w:rPr>
+        <w:t>第一层是语义层。分析师维护指标口径、Join 关系和查询边界，业务语言先映射到这些定义，再生成 SQL。这样同一个问题不会每次被重新解释，也更接近 Microsoft 所说的 managed self-service BI：核心有纪律，边缘有灵活性。</w:t>
+      </w:r>
+    </w:p>
+    <w:p>
+      <w:pPr>
+        <w:spacing w:after="120" w:line="276" w:lineRule="auto"/>
+      </w:pPr>
+      <w:r>
+        <w:rPr>
+          <w:rFonts w:ascii="Arial" w:hAnsi="Arial" w:eastAsia="Microsoft YaHei"/>
+        </w:rPr>
+        <w:t>第二层是 Agent 循环。Agent 做四件事：理解业务问题，生成 SQL；用 AST 做只读安全校验；执行查询并读取结果；把结果转成图表和可验证的业务解释。如果 SQL 出错，它会带着错误信息重新修正，而不是把异常丢给业务用户。</w:t>
+      </w:r>
+    </w:p>
+    <w:p>
+      <w:pPr>
+        <w:spacing w:after="120" w:line="276" w:lineRule="auto"/>
+      </w:pPr>
+      <w:r>
+        <w:rPr>
+          <w:rFonts w:ascii="Arial" w:hAnsi="Arial" w:eastAsia="Microsoft YaHei"/>
+        </w:rPr>
+        <w:t>第三层是数据边界。模型只看到 schema，不接触原始数据；数据库连接只读；SQL 只允许 SELECT，并自动补 LIMIT。也就是说，LLM 不是安全边界，策略引擎和执行层才是安全边界。</w:t>
+      </w:r>
+    </w:p>
+    <w:p>
+      <w:pPr>
+        <w:spacing w:after="120" w:line="276" w:lineRule="auto"/>
+      </w:pPr>
+      <w:r>
+        <w:rPr>
+          <w:rFonts w:ascii="Arial" w:hAnsi="Arial" w:eastAsia="Microsoft YaHei"/>
+        </w:rPr>
+        <w:t>为什么这里必须引入 Agent？因为商业分析不是一次 SQL 翻译。业务问题会追问、会比较、会要求解释原因。单纯 Text-to-SQL 只能给一条查询，QueryForge 把查询生成、验证、执行、解释和复用放进同一个可审计流程。</w:t>
+      </w:r>
+    </w:p>
+    <w:p>
+      <w:pPr>
+        <w:pStyle w:val="Heading1"/>
+      </w:pPr>
+      <w:r>
+        <w:rPr>
+          <w:rFonts w:ascii="Arial" w:hAnsi="Arial" w:eastAsia="Microsoft YaHei"/>
+        </w:rPr>
+        <w:t>Mavis｜收束（约 40 秒）</w:t>
+      </w:r>
+    </w:p>
+    <w:p>
+      <w:pPr>
+        <w:spacing w:after="120" w:line="276" w:lineRule="auto"/>
+      </w:pPr>
+      <w:r>
+        <w:rPr>
+          <w:rFonts w:ascii="Arial" w:hAnsi="Arial" w:eastAsia="Microsoft YaHei"/>
+        </w:rPr>
+        <w:t>所以 QueryForge 的定位是：把分析师定义的标准放进业务日常决策。它不是替代分析师，而是把分析师的指标口径、业务判断和治理要求产品化。</w:t>
+      </w:r>
+    </w:p>
+    <w:p>
+      <w:pPr>
+        <w:spacing w:after="120" w:line="276" w:lineRule="auto"/>
+      </w:pPr>
+      <w:r>
+        <w:rPr>
+          <w:rFonts w:ascii="Arial" w:hAnsi="Arial" w:eastAsia="Microsoft YaHei"/>
+        </w:rPr>
+        <w:t>从 hackathon 到 MVP，第一步接 PostgreSQL、用户认证和审计日志；第二步做 SSO、行级权限、PII 脱敏和多数据源；第三步对接 Snowflake、BigQuery、dbt 语义层。我们现场可以打开线上版本，所有图表和查询都跑在 Olist 数据库上。</w:t>
+      </w:r>
+    </w:p>
+    <w:p>
+      <w:pPr>
+        <w:pStyle w:val="Heading1"/>
+      </w:pPr>
+      <w:r>
+        <w:rPr>
+          <w:rFonts w:ascii="Arial" w:hAnsi="Arial" w:eastAsia="Microsoft YaHei"/>
+        </w:rPr>
+        <w:t>演示流程</w:t>
+      </w:r>
+    </w:p>
+    <w:p>
+      <w:pPr>
+        <w:spacing w:after="120" w:line="276" w:lineRule="auto"/>
+      </w:pPr>
+      <w:r>
+        <w:rPr>
+          <w:rFonts w:ascii="Arial" w:hAnsi="Arial" w:eastAsia="Microsoft YaHei"/>
+        </w:rPr>
+        <w:t>打开页面，先让评委看到 KPI：99,441 订单、R$1,601 万营收、96,096 用户、74 品类。</w:t>
+      </w:r>
+    </w:p>
+    <w:p>
+      <w:pPr>
+        <w:spacing w:after="120" w:line="276" w:lineRule="auto"/>
+      </w:pPr>
+      <w:r>
+        <w:rPr>
+          <w:rFonts w:ascii="Arial" w:hAnsi="Arial" w:eastAsia="Microsoft YaHei"/>
+        </w:rPr>
+        <w:t>点击「各地区客单价差异分析」，展示图表、SQL 和分析报告。</w:t>
+      </w:r>
+    </w:p>
+    <w:p>
+      <w:pPr>
+        <w:spacing w:after="120" w:line="276" w:lineRule="auto"/>
+      </w:pPr>
+      <w:r>
+        <w:rPr>
+          <w:rFonts w:ascii="Arial" w:hAnsi="Arial" w:eastAsia="Microsoft YaHei"/>
+        </w:rPr>
+        <w:t>再点「复购用户的品类跨越路径」，强调它不是静态看板，而是业务问题驱动的查询。</w:t>
+      </w:r>
+    </w:p>
+    <w:p>
+      <w:pPr>
+        <w:spacing w:after="120" w:line="276" w:lineRule="auto"/>
+      </w:pPr>
+      <w:r>
+        <w:rPr>
+          <w:rFonts w:ascii="Arial" w:hAnsi="Arial" w:eastAsia="Microsoft YaHei"/>
+        </w:rPr>
+        <w:t>如果要手输问题，使用：「为什么 Sudeste 的 2017 年 11 月营收明显冲高？」</w:t>
+      </w:r>
+    </w:p>
+    <w:p>
+      <w:pPr>
+        <w:spacing w:after="120" w:line="276" w:lineRule="auto"/>
+      </w:pPr>
+      <w:r>
+        <w:rPr>
+          <w:rFonts w:ascii="Arial" w:hAnsi="Arial" w:eastAsia="Microsoft YaHei"/>
+        </w:rPr>
+        <w:t>如果 API 超时，不等超过 8 秒，直接点预设问题。预设有缓存兜底。</w:t>
+      </w:r>
+    </w:p>
+    <w:p>
+      <w:pPr>
+        <w:pStyle w:val="Heading1"/>
+      </w:pPr>
+      <w:r>
+        <w:rPr>
+          <w:rFonts w:ascii="Arial" w:hAnsi="Arial" w:eastAsia="Microsoft YaHei"/>
+        </w:rPr>
         <w:t>Q&amp;A 预案</w:t>
+      </w:r>
+    </w:p>
+    <w:p>
+      <w:pPr>
+        <w:spacing w:after="120" w:line="276" w:lineRule="auto"/>
+      </w:pPr>
+      <w:r>
+        <w:rPr>
+          <w:rFonts w:ascii="Arial" w:hAnsi="Arial" w:eastAsia="Microsoft YaHei"/>
+        </w:rPr>
+        <w:t>Q: 和普通 BI 看板有什么区别？ A: 看板回答固定问题；QueryForge 支持围绕同一语义层连续追问，同时保留权限、口径和审计。</w:t>
+      </w:r>
+    </w:p>
+    <w:p>
+      <w:pPr>
+        <w:spacing w:after="120" w:line="276" w:lineRule="auto"/>
+      </w:pPr>
+      <w:r>
+        <w:rPr>
+          <w:rFonts w:ascii="Arial" w:hAnsi="Arial" w:eastAsia="Microsoft YaHei"/>
+        </w:rPr>
+        <w:t>Q: 和 ChatGPT 写 SQL 有什么区别？ A: ChatGPT 直接写 SQL 风险在口径和权限。QueryForge 先经过语义层，再做 AST 校验和只读执行。</w:t>
+      </w:r>
+    </w:p>
+    <w:p>
+      <w:pPr>
+        <w:spacing w:after="120" w:line="276" w:lineRule="auto"/>
+      </w:pPr>
+      <w:r>
+        <w:rPr>
+          <w:rFonts w:ascii="Arial" w:hAnsi="Arial" w:eastAsia="Microsoft YaHei"/>
+        </w:rPr>
+        <w:t>Q: 数据真实吗？ A: 是 Kaggle Olist 公开电商数据集，约 10 万笔真实匿名商业订单。</w:t>
+      </w:r>
+    </w:p>
+    <w:p>
+      <w:pPr>
+        <w:spacing w:after="120" w:line="276" w:lineRule="auto"/>
+      </w:pPr>
+      <w:r>
+        <w:rPr>
+          <w:rFonts w:ascii="Arial" w:hAnsi="Arial" w:eastAsia="Microsoft YaHei"/>
+        </w:rPr>
+        <w:t>Q: 大模型幻觉怎么办？ A: 不让模型成为权威。它生成候选 SQL，系统用 schema、语义层、AST 校验和数据库结果约束它。</w:t>
+      </w:r>
+    </w:p>
+    <w:p>
+      <w:pPr>
+        <w:spacing w:after="120" w:line="276" w:lineRule="auto"/>
+      </w:pPr>
+      <w:r>
+        <w:rPr>
+          <w:rFonts w:ascii="Arial" w:hAnsi="Arial" w:eastAsia="Microsoft YaHei"/>
+        </w:rPr>
+        <w:t>Q: 怎么商业化？ A: 面向数据团队和业务部门，按席位、查询量、私有部署和企业数据源连接收费。企业版重点是 SSO、RBAC、审计日志和多数据源。</w:t>
       </w:r>
     </w:p>
     <w:p>
       <w:r>
         <w:rPr>
+          <w:rFonts w:ascii="Arial" w:hAnsi="Arial" w:eastAsia="Microsoft YaHei"/>
           <w:b/>
-          <w:sz w:val="26"/>
         </w:rPr>
-        <w:t>Q: 和 ChatGPT 有什么区别？</w:t>
+        <w:t>措辞参考：</w:t>
       </w:r>
-    </w:p>
-    <w:p>
-      <w:pPr>
-        <w:spacing w:after="200"/>
-      </w:pPr>
-      <w:r>
-        <w:t>A: ChatGPT 需要用户自己写 SQL 或者给它数据库权限。我们是分析师定义指标，业务人员只用自然语言问。而且大模型永远不接触原始数据——它只看表名。</w:t>
-      </w:r>
-    </w:p>
-    <w:p>
       <w:r>
         <w:rPr>
-          <w:b/>
-          <w:sz w:val="26"/>
+          <w:rFonts w:ascii="Arial" w:hAnsi="Arial" w:eastAsia="Microsoft YaHei"/>
         </w:rPr>
-        <w:t>Q: 数据是假的吧？</w:t>
-      </w:r>
-    </w:p>
-    <w:p>
-      <w:pPr>
-        <w:spacing w:after="200"/>
-      </w:pPr>
-      <w:r>
-        <w:t>A: 不是。Kaggle 上 Olist 巴西电商公开数据集，99,441 笔真实交易。评委可以去 Kaggle 验证。</w:t>
-      </w:r>
-    </w:p>
-    <w:p>
-      <w:r>
-        <w:rPr>
-          <w:b/>
-          <w:sz w:val="26"/>
-        </w:rPr>
-        <w:t>Q: 大模型幻觉怎么办？</w:t>
-      </w:r>
-    </w:p>
-    <w:p>
-      <w:pPr>
-        <w:spacing w:after="200"/>
-      </w:pPr>
-      <w:r>
-        <w:t>A: 三层防御。大模型只看 Schema 不看数据。SQL 语法树验证只允许 SELECT。自纠正循环——出错自动修正重试。</w:t>
-      </w:r>
-    </w:p>
-    <w:p>
-      <w:r>
-        <w:rPr>
-          <w:b/>
-          <w:sz w:val="26"/>
-        </w:rPr>
-        <w:t>Q: 怎么商业化？</w:t>
-      </w:r>
-    </w:p>
-    <w:p>
-      <w:pPr>
-        <w:spacing w:after="200"/>
-      </w:pPr>
-      <w:r>
-        <w:t>A: SaaS 按查询量收费。企业版支持私有部署、SSO、审计日志。核心壁垒是语义层——指标定义越多切换成本越高。</w:t>
-      </w:r>
-    </w:p>
-    <w:p/>
-    <w:p>
-      <w:pPr>
-        <w:pStyle w:val="Heading1"/>
-      </w:pPr>
-      <w:r>
-        <w:t>演示流程</w:t>
-      </w:r>
-    </w:p>
-    <w:p>
-      <w:pPr>
-        <w:pStyle w:val="ListNumber"/>
-      </w:pPr>
-      <w:r>
-        <w:t>打开页面，看 KPI 卡片（3 秒）</w:t>
-      </w:r>
-    </w:p>
-    <w:p>
-      <w:pPr>
-        <w:pStyle w:val="ListNumber"/>
-      </w:pPr>
-      <w:r>
-        <w:t>点「各地区客单价差异分析」→ 出图表 + 分析报告</w:t>
-      </w:r>
-    </w:p>
-    <w:p>
-      <w:pPr>
-        <w:pStyle w:val="ListNumber"/>
-      </w:pPr>
-      <w:r>
-        <w:t>手输一个问题：「华东和华南的品类偏好有什么差异？」</w:t>
-      </w:r>
-    </w:p>
-    <w:p>
-      <w:pPr>
-        <w:pStyle w:val="ListNumber"/>
-      </w:pPr>
-      <w:r>
-        <w:t>展示自纠正：问一个可能出错的问题</w:t>
-      </w:r>
-    </w:p>
-    <w:p>
-      <w:pPr>
-        <w:pStyle w:val="ListNumber"/>
-      </w:pPr>
-      <w:r>
-        <w:t>切到看板页面，展示实时图表</w:t>
-      </w:r>
-    </w:p>
-    <w:p>
-      <w:pPr>
-        <w:pStyle w:val="ListNumber"/>
-      </w:pPr>
-      <w:r>
-        <w:t>指向二维码，说谢谢</w:t>
-      </w:r>
-    </w:p>
-    <w:p/>
-    <w:p>
-      <w:r>
-        <w:rPr>
-          <w:b/>
-        </w:rPr>
-        <w:t>如果 API 超时：</w:t>
-      </w:r>
-      <w:r>
-        <w:t>点预设问题（有缓存兜底，秒出结果）。不要等超过 8 秒。</w:t>
+        <w:t xml:space="preserve"> Kaggle/Olist 数据集说明；Gartner Data &amp; Analytics；Microsoft managed self-service BI；Tableau modern BI；IBM self-service analytics；Dun &amp; Bradstreet trusted business data。</w:t>
       </w:r>
     </w:p>
     <w:sectPr>
       <w:pgSz w:w="12240" w:h="15840"/>
-      <w:pgMar w:top="1440" w:right="1800" w:bottom="1440" w:left="1800" w:header="720" w:footer="720" w:gutter="0"/>
+      <w:pgMar w:top="1080" w:right="1080" w:bottom="1080" w:left="1080" w:header="720" w:footer="720" w:gutter="0"/>
       <w:cols w:space="720"/>
       <w:docGrid w:linePitch="360"/>
     </w:sectPr>
@@ -632,6 +700,10 @@
     <w:name w:val="Normal"/>
     <w:qFormat/>
     <w:rsid w:val="00FC693F"/>
+    <w:rPr>
+      <w:rFonts w:ascii="Arial" w:hAnsi="Arial" w:eastAsia="Microsoft YaHei"/>
+      <w:sz w:val="21"/>
+    </w:rPr>
   </w:style>
   <w:style w:type="paragraph" w:styleId="Header">
     <w:name w:val="header"/>
@@ -692,7 +764,7 @@
       <w:outlineLvl w:val="0"/>
     </w:pPr>
     <w:rPr>
-      <w:rFonts w:asciiTheme="majorHAnsi" w:eastAsiaTheme="majorEastAsia" w:hAnsiTheme="majorHAnsi" w:cstheme="majorBidi"/>
+      <w:rFonts w:asciiTheme="majorHAnsi" w:eastAsiaTheme="majorEastAsia" w:hAnsiTheme="majorHAnsi" w:cstheme="majorBidi" w:ascii="Arial" w:hAnsi="Arial" w:eastAsia="Microsoft YaHei"/>
       <w:b/>
       <w:bCs/>
       <w:color w:val="365F91" w:themeColor="accent1" w:themeShade="BF"/>
@@ -716,7 +788,7 @@
       <w:outlineLvl w:val="1"/>
     </w:pPr>
     <w:rPr>
-      <w:rFonts w:asciiTheme="majorHAnsi" w:eastAsiaTheme="majorEastAsia" w:hAnsiTheme="majorHAnsi" w:cstheme="majorBidi"/>
+      <w:rFonts w:asciiTheme="majorHAnsi" w:eastAsiaTheme="majorEastAsia" w:hAnsiTheme="majorHAnsi" w:cstheme="majorBidi" w:ascii="Arial" w:hAnsi="Arial" w:eastAsia="Microsoft YaHei"/>
       <w:b/>
       <w:bCs/>
       <w:color w:val="4F81BD" w:themeColor="accent1"/>
@@ -981,7 +1053,7 @@
       <w:contextualSpacing/>
     </w:pPr>
     <w:rPr>
-      <w:rFonts w:asciiTheme="majorHAnsi" w:eastAsiaTheme="majorEastAsia" w:hAnsiTheme="majorHAnsi" w:cstheme="majorBidi"/>
+      <w:rFonts w:asciiTheme="majorHAnsi" w:eastAsiaTheme="majorEastAsia" w:hAnsiTheme="majorHAnsi" w:cstheme="majorBidi" w:ascii="Arial" w:hAnsi="Arial" w:eastAsia="Microsoft YaHei"/>
       <w:color w:val="17365D" w:themeColor="text2" w:themeShade="BF"/>
       <w:spacing w:val="5"/>
       <w:kern w:val="28"/>

</xml_diff>

<commit_message>
feat: pivot QueryForge to local ecommerce analytics app
</commit_message>
<xml_diff>
--- a/assets/speaker-notes.docx
+++ b/assets/speaker-notes.docx
@@ -1,340 +1,334 @@
 
 <file path=word/document.xml><?xml version="1.0" encoding="utf-8"?>
-<w:document xmlns:wpc="http://schemas.microsoft.com/office/word/2010/wordprocessingCanvas" xmlns:mo="http://schemas.microsoft.com/office/mac/office/2008/main" xmlns:mc="http://schemas.openxmlformats.org/markup-compatibility/2006" xmlns:mv="urn:schemas-microsoft-com:mac:vml" xmlns:o="urn:schemas-microsoft-com:office:office" xmlns:r="http://schemas.openxmlformats.org/officeDocument/2006/relationships" xmlns:m="http://schemas.openxmlformats.org/officeDocument/2006/math" xmlns:v="urn:schemas-microsoft-com:vml" xmlns:wp14="http://schemas.microsoft.com/office/word/2010/wordprocessingDrawing" xmlns:wp="http://schemas.openxmlformats.org/drawingml/2006/wordprocessingDrawing" xmlns:w10="urn:schemas-microsoft-com:office:word" xmlns:w="http://schemas.openxmlformats.org/wordprocessingml/2006/main" xmlns:w14="http://schemas.microsoft.com/office/word/2010/wordml" xmlns:wpg="http://schemas.microsoft.com/office/word/2010/wordprocessingGroup" xmlns:wpi="http://schemas.microsoft.com/office/word/2010/wordprocessingInk" xmlns:wne="http://schemas.microsoft.com/office/word/2006/wordml" xmlns:wps="http://schemas.microsoft.com/office/word/2010/wordprocessingShape" mc:Ignorable="w14 wp14">
-  <w:body>
-    <w:p>
-      <w:pPr>
-        <w:jc w:val="center"/>
-      </w:pPr>
-      <w:r>
-        <w:rPr>
-          <w:rFonts w:ascii="Arial" w:hAnsi="Arial" w:eastAsia="Microsoft YaHei"/>
-          <w:b/>
-          <w:sz w:val="36"/>
-        </w:rPr>
-        <w:t>QueryForge 路演讲稿（双人版）</w:t>
-      </w:r>
-    </w:p>
-    <w:p>
-      <w:pPr>
-        <w:jc w:val="center"/>
-      </w:pPr>
-      <w:r>
-        <w:rPr>
-          <w:rFonts w:ascii="Arial" w:hAnsi="Arial" w:eastAsia="Microsoft YaHei"/>
-        </w:rPr>
-        <w:t>分工：Mavis 负责商业叙事，Eric 负责开发与技术可信度。5 分钟演示 + 3 分钟 Q&amp;A，可按现场时间删减。</w:t>
-      </w:r>
-    </w:p>
-    <w:p>
-      <w:pPr>
-        <w:pStyle w:val="Heading1"/>
-      </w:pPr>
-      <w:r>
-        <w:rPr>
-          <w:rFonts w:ascii="Arial" w:hAnsi="Arial" w:eastAsia="Microsoft YaHei"/>
-        </w:rPr>
-        <w:t>Mavis｜商业叙述（约 2 分钟）</w:t>
-      </w:r>
-    </w:p>
-    <w:p>
-      <w:pPr>
-        <w:spacing w:after="120" w:line="276" w:lineRule="auto"/>
-      </w:pPr>
-      <w:r>
-        <w:rPr>
-          <w:rFonts w:ascii="Arial" w:hAnsi="Arial" w:eastAsia="Microsoft YaHei"/>
-        </w:rPr>
-        <w:t>大家好，我们做的是 QueryForge，一个受治理的自助式商业分析层。它不是再做一张漂亮看板，而是解决企业里很常见的矛盾：业务要速度，数据团队要口径、权限和审计。</w:t>
-      </w:r>
-    </w:p>
-    <w:p>
-      <w:pPr>
-        <w:spacing w:after="120" w:line="276" w:lineRule="auto"/>
-      </w:pPr>
-      <w:r>
-        <w:rPr>
-          <w:rFonts w:ascii="Arial" w:hAnsi="Arial" w:eastAsia="Microsoft YaHei"/>
-        </w:rPr>
-        <w:t>Gartner 对数据分析的定义很直接：管理数据、分析数据，是为了改进决策、业务流程和结果。Tableau 和 IBM 讲现代 BI，也都强调 self-service analytics、governed data 和 speed to insight。QueryForge 对准的就是这块：让业务可以追问，同时让数据团队保留治理边界。</w:t>
-      </w:r>
-    </w:p>
-    <w:p>
-      <w:pPr>
-        <w:spacing w:after="120" w:line="276" w:lineRule="auto"/>
-      </w:pPr>
-      <w:r>
-        <w:rPr>
-          <w:rFonts w:ascii="Arial" w:hAnsi="Arial" w:eastAsia="Microsoft YaHei"/>
-        </w:rPr>
-        <w:t>今天使用的是公开真实数据。我们接入 Kaggle 上的 Olist Brazilian E-Commerce Public Dataset，约 10 万笔巴西电商订单，包含订单状态、价格、支付、物流、客户位置、商品属性和评价。这个数据足够接近真实业务问题：区域、品类、支付方式、复购、物流和评价可以串起来看。</w:t>
-      </w:r>
-    </w:p>
-    <w:p>
-      <w:pPr>
-        <w:spacing w:after="120" w:line="276" w:lineRule="auto"/>
-      </w:pPr>
-      <w:r>
-        <w:rPr>
-          <w:rFonts w:ascii="Arial" w:hAnsi="Arial" w:eastAsia="Microsoft YaHei"/>
-        </w:rPr>
-        <w:t>商业上，QueryForge 的用户不是单一角色。数据团队关心的是减少重复取数、统一指标口径、降低审计成本；运营和市场关心的是不用排队等临时报表，可以围绕同一份可信数据连续追问。商业模式也很清楚：团队席位、查询量、私有部署和企业数据源连接。</w:t>
-      </w:r>
-    </w:p>
-    <w:p>
-      <w:pPr>
-        <w:pStyle w:val="Heading1"/>
-      </w:pPr>
-      <w:r>
-        <w:rPr>
-          <w:rFonts w:ascii="Arial" w:hAnsi="Arial" w:eastAsia="Microsoft YaHei"/>
-        </w:rPr>
-        <w:t>Eric｜开发阐述（约 2 分钟）</w:t>
-      </w:r>
-    </w:p>
-    <w:p>
-      <w:pPr>
-        <w:spacing w:after="120" w:line="276" w:lineRule="auto"/>
-      </w:pPr>
-      <w:r>
-        <w:rPr>
-          <w:rFonts w:ascii="Arial" w:hAnsi="Arial" w:eastAsia="Microsoft YaHei"/>
-        </w:rPr>
-        <w:t>我讲技术实现。这个产品的关键不是让大模型直接猜 SQL，而是三层结构：统一语义层、验证式 Agent 循环、执行与治理边界。</w:t>
-      </w:r>
-    </w:p>
-    <w:p>
-      <w:pPr>
-        <w:spacing w:after="120" w:line="276" w:lineRule="auto"/>
-      </w:pPr>
-      <w:r>
-        <w:rPr>
-          <w:rFonts w:ascii="Arial" w:hAnsi="Arial" w:eastAsia="Microsoft YaHei"/>
-        </w:rPr>
-        <w:t>第一层是语义层。分析师维护指标口径、Join 关系和查询边界，业务语言先映射到这些定义，再生成 SQL。这样同一个问题不会每次被重新解释，也更接近 Microsoft 所说的 managed self-service BI：核心有纪律，边缘有灵活性。</w:t>
-      </w:r>
-    </w:p>
-    <w:p>
-      <w:pPr>
-        <w:spacing w:after="120" w:line="276" w:lineRule="auto"/>
-      </w:pPr>
-      <w:r>
-        <w:rPr>
-          <w:rFonts w:ascii="Arial" w:hAnsi="Arial" w:eastAsia="Microsoft YaHei"/>
-        </w:rPr>
-        <w:t>第二层是 Agent 循环。Agent 做四件事：理解业务问题，生成 SQL；用 AST 做只读安全校验；执行查询并读取结果；把结果转成图表和可验证的业务解释。如果 SQL 出错，它会带着错误信息重新修正，而不是把异常丢给业务用户。</w:t>
-      </w:r>
-    </w:p>
-    <w:p>
-      <w:pPr>
-        <w:spacing w:after="120" w:line="276" w:lineRule="auto"/>
-      </w:pPr>
-      <w:r>
-        <w:rPr>
-          <w:rFonts w:ascii="Arial" w:hAnsi="Arial" w:eastAsia="Microsoft YaHei"/>
-        </w:rPr>
-        <w:t>第三层是数据边界。模型只看到 schema，不接触原始数据；数据库连接只读；SQL 只允许 SELECT，并自动补 LIMIT。也就是说，LLM 不是安全边界，策略引擎和执行层才是安全边界。</w:t>
-      </w:r>
-    </w:p>
-    <w:p>
-      <w:pPr>
-        <w:spacing w:after="120" w:line="276" w:lineRule="auto"/>
-      </w:pPr>
-      <w:r>
-        <w:rPr>
-          <w:rFonts w:ascii="Arial" w:hAnsi="Arial" w:eastAsia="Microsoft YaHei"/>
-        </w:rPr>
-        <w:t>为什么这里必须引入 Agent？因为商业分析不是一次 SQL 翻译。业务问题会追问、会比较、会要求解释原因。单纯 Text-to-SQL 只能给一条查询，QueryForge 把查询生成、验证、执行、解释和复用放进同一个可审计流程。</w:t>
-      </w:r>
-    </w:p>
-    <w:p>
-      <w:pPr>
-        <w:pStyle w:val="Heading1"/>
-      </w:pPr>
-      <w:r>
-        <w:rPr>
-          <w:rFonts w:ascii="Arial" w:hAnsi="Arial" w:eastAsia="Microsoft YaHei"/>
-        </w:rPr>
-        <w:t>Mavis｜收束（约 40 秒）</w:t>
-      </w:r>
-    </w:p>
-    <w:p>
-      <w:pPr>
-        <w:spacing w:after="120" w:line="276" w:lineRule="auto"/>
-      </w:pPr>
-      <w:r>
-        <w:rPr>
-          <w:rFonts w:ascii="Arial" w:hAnsi="Arial" w:eastAsia="Microsoft YaHei"/>
-        </w:rPr>
-        <w:t>所以 QueryForge 的定位是：把分析师定义的标准放进业务日常决策。它不是替代分析师，而是把分析师的指标口径、业务判断和治理要求产品化。</w:t>
-      </w:r>
-    </w:p>
-    <w:p>
-      <w:pPr>
-        <w:spacing w:after="120" w:line="276" w:lineRule="auto"/>
-      </w:pPr>
-      <w:r>
-        <w:rPr>
-          <w:rFonts w:ascii="Arial" w:hAnsi="Arial" w:eastAsia="Microsoft YaHei"/>
-        </w:rPr>
-        <w:t>从 hackathon 到 MVP，第一步接 PostgreSQL、用户认证和审计日志；第二步做 SSO、行级权限、PII 脱敏和多数据源；第三步对接 Snowflake、BigQuery、dbt 语义层。我们现场可以打开线上版本，所有图表和查询都跑在 Olist 数据库上。</w:t>
-      </w:r>
-    </w:p>
-    <w:p>
-      <w:pPr>
-        <w:pStyle w:val="Heading1"/>
-      </w:pPr>
-      <w:r>
-        <w:rPr>
-          <w:rFonts w:ascii="Arial" w:hAnsi="Arial" w:eastAsia="Microsoft YaHei"/>
-        </w:rPr>
-        <w:t>演示流程</w:t>
-      </w:r>
-    </w:p>
-    <w:p>
-      <w:pPr>
-        <w:spacing w:after="120" w:line="276" w:lineRule="auto"/>
-      </w:pPr>
-      <w:r>
-        <w:rPr>
-          <w:rFonts w:ascii="Arial" w:hAnsi="Arial" w:eastAsia="Microsoft YaHei"/>
-        </w:rPr>
-        <w:t>打开页面，先让评委看到 KPI：99,441 订单、R$1,601 万营收、96,096 用户、74 品类。</w:t>
-      </w:r>
-    </w:p>
-    <w:p>
-      <w:pPr>
-        <w:spacing w:after="120" w:line="276" w:lineRule="auto"/>
-      </w:pPr>
-      <w:r>
-        <w:rPr>
-          <w:rFonts w:ascii="Arial" w:hAnsi="Arial" w:eastAsia="Microsoft YaHei"/>
-        </w:rPr>
-        <w:t>点击「各地区客单价差异分析」，展示图表、SQL 和分析报告。</w:t>
-      </w:r>
-    </w:p>
-    <w:p>
-      <w:pPr>
-        <w:spacing w:after="120" w:line="276" w:lineRule="auto"/>
-      </w:pPr>
-      <w:r>
-        <w:rPr>
-          <w:rFonts w:ascii="Arial" w:hAnsi="Arial" w:eastAsia="Microsoft YaHei"/>
-        </w:rPr>
-        <w:t>再点「复购用户的品类跨越路径」，强调它不是静态看板，而是业务问题驱动的查询。</w:t>
-      </w:r>
-    </w:p>
-    <w:p>
-      <w:pPr>
-        <w:spacing w:after="120" w:line="276" w:lineRule="auto"/>
-      </w:pPr>
-      <w:r>
-        <w:rPr>
-          <w:rFonts w:ascii="Arial" w:hAnsi="Arial" w:eastAsia="Microsoft YaHei"/>
-        </w:rPr>
-        <w:t>如果要手输问题，使用：「为什么 Sudeste 的 2017 年 11 月营收明显冲高？」</w:t>
-      </w:r>
-    </w:p>
-    <w:p>
-      <w:pPr>
-        <w:spacing w:after="120" w:line="276" w:lineRule="auto"/>
-      </w:pPr>
-      <w:r>
-        <w:rPr>
-          <w:rFonts w:ascii="Arial" w:hAnsi="Arial" w:eastAsia="Microsoft YaHei"/>
-        </w:rPr>
-        <w:t>如果 API 超时，不等超过 8 秒，直接点预设问题。预设有缓存兜底。</w:t>
-      </w:r>
-    </w:p>
-    <w:p>
-      <w:pPr>
-        <w:pStyle w:val="Heading1"/>
-      </w:pPr>
-      <w:r>
-        <w:rPr>
-          <w:rFonts w:ascii="Arial" w:hAnsi="Arial" w:eastAsia="Microsoft YaHei"/>
-        </w:rPr>
-        <w:t>Q&amp;A 预案</w:t>
-      </w:r>
-    </w:p>
-    <w:p>
-      <w:pPr>
-        <w:spacing w:after="120" w:line="276" w:lineRule="auto"/>
-      </w:pPr>
-      <w:r>
-        <w:rPr>
-          <w:rFonts w:ascii="Arial" w:hAnsi="Arial" w:eastAsia="Microsoft YaHei"/>
-        </w:rPr>
-        <w:t>Q: 和普通 BI 看板有什么区别？ A: 看板回答固定问题；QueryForge 支持围绕同一语义层连续追问，同时保留权限、口径和审计。</w:t>
-      </w:r>
-    </w:p>
-    <w:p>
-      <w:pPr>
-        <w:spacing w:after="120" w:line="276" w:lineRule="auto"/>
-      </w:pPr>
-      <w:r>
-        <w:rPr>
-          <w:rFonts w:ascii="Arial" w:hAnsi="Arial" w:eastAsia="Microsoft YaHei"/>
-        </w:rPr>
-        <w:t>Q: 和 ChatGPT 写 SQL 有什么区别？ A: ChatGPT 直接写 SQL 风险在口径和权限。QueryForge 先经过语义层，再做 AST 校验和只读执行。</w:t>
-      </w:r>
-    </w:p>
-    <w:p>
-      <w:pPr>
-        <w:spacing w:after="120" w:line="276" w:lineRule="auto"/>
-      </w:pPr>
-      <w:r>
-        <w:rPr>
-          <w:rFonts w:ascii="Arial" w:hAnsi="Arial" w:eastAsia="Microsoft YaHei"/>
-        </w:rPr>
-        <w:t>Q: 数据真实吗？ A: 是 Kaggle Olist 公开电商数据集，约 10 万笔真实匿名商业订单。</w:t>
-      </w:r>
-    </w:p>
-    <w:p>
-      <w:pPr>
-        <w:spacing w:after="120" w:line="276" w:lineRule="auto"/>
-      </w:pPr>
-      <w:r>
-        <w:rPr>
-          <w:rFonts w:ascii="Arial" w:hAnsi="Arial" w:eastAsia="Microsoft YaHei"/>
-        </w:rPr>
-        <w:t>Q: 大模型幻觉怎么办？ A: 不让模型成为权威。它生成候选 SQL，系统用 schema、语义层、AST 校验和数据库结果约束它。</w:t>
-      </w:r>
-    </w:p>
-    <w:p>
-      <w:pPr>
-        <w:spacing w:after="120" w:line="276" w:lineRule="auto"/>
-      </w:pPr>
-      <w:r>
-        <w:rPr>
-          <w:rFonts w:ascii="Arial" w:hAnsi="Arial" w:eastAsia="Microsoft YaHei"/>
-        </w:rPr>
-        <w:t>Q: 怎么商业化？ A: 面向数据团队和业务部门，按席位、查询量、私有部署和企业数据源连接收费。企业版重点是 SSO、RBAC、审计日志和多数据源。</w:t>
-      </w:r>
-    </w:p>
-    <w:p>
-      <w:r>
-        <w:rPr>
-          <w:rFonts w:ascii="Arial" w:hAnsi="Arial" w:eastAsia="Microsoft YaHei"/>
-          <w:b/>
-        </w:rPr>
-        <w:t>措辞参考：</w:t>
-      </w:r>
-      <w:r>
-        <w:rPr>
-          <w:rFonts w:ascii="Arial" w:hAnsi="Arial" w:eastAsia="Microsoft YaHei"/>
-        </w:rPr>
-        <w:t xml:space="preserve"> Kaggle/Olist 数据集说明；Gartner Data &amp; Analytics；Microsoft managed self-service BI；Tableau modern BI；IBM self-service analytics；Dun &amp; Bradstreet trusted business data。</w:t>
-      </w:r>
-    </w:p>
-    <w:sectPr>
-      <w:pgSz w:w="12240" w:h="15840"/>
-      <w:pgMar w:top="1080" w:right="1080" w:bottom="1080" w:left="1080" w:header="720" w:footer="720" w:gutter="0"/>
-      <w:cols w:space="720"/>
-      <w:docGrid w:linePitch="360"/>
-    </w:sectPr>
-  </w:body>
-</w:document>
+<ns0:document xmlns:ns0="http://schemas.openxmlformats.org/wordprocessingml/2006/main" xmlns:ns1="http://schemas.openxmlformats.org/markup-compatibility/2006" ns1:Ignorable="w14 wp14">
+  <ns0:body>
+    <ns0:p>
+      <ns0:pPr>
+        <ns0:jc ns0:val="center"/>
+      </ns0:pPr>
+      <ns0:r>
+        <ns0:rPr>
+          <ns0:rFonts ns0:ascii="Arial" ns0:hAnsi="Arial" ns0:eastAsia="Microsoft YaHei"/>
+          <ns0:b/>
+          <ns0:sz ns0:val="36"/>
+        </ns0:rPr>
+        <ns0:t>QueryForge 路演讲稿（双人版）</ns0:t>
+      </ns0:r>
+    </ns0:p>
+    <ns0:p>
+      <ns0:pPr>
+        <ns0:jc ns0:val="center"/>
+      </ns0:pPr>
+      <ns0:r>
+        <ns0:rPr>
+          <ns0:rFonts ns0:ascii="Arial" ns0:hAnsi="Arial" ns0:eastAsia="Microsoft YaHei"/>
+        </ns0:rPr>
+        <ns0:t>分工：Mavis 负责商业叙事，Eric 负责开发与技术可信度。5 分钟演示 + 3 分钟 Q&amp;A，可按现场时间删减。</ns0:t>
+      </ns0:r>
+    </ns0:p>
+    <ns0:p>
+      <ns0:pPr>
+        <ns0:pStyle ns0:val="Heading1"/>
+      </ns0:pPr>
+      <ns0:r>
+        <ns0:rPr>
+          <ns0:rFonts ns0:ascii="Arial" ns0:hAnsi="Arial" ns0:eastAsia="Microsoft YaHei"/>
+        </ns0:rPr>
+        <ns0:t>Mavis｜商业叙述（约 2 分钟）</ns0:t>
+      </ns0:r>
+    </ns0:p>
+    <ns0:p>
+      <ns0:pPr>
+        <ns0:spacing ns0:after="120" ns0:line="276" ns0:lineRule="auto"/>
+      </ns0:pPr>
+      <ns0:r>
+        <ns0:rPr>
+          <ns0:rFonts ns0:ascii="Arial" ns0:hAnsi="Arial" ns0:eastAsia="Microsoft YaHei"/>
+        </ns0:rPr>
+        <ns0:t>大家好，我们做的是 QueryForge，一个让电商经营者获得专业数据分析能力的本地分析工具。它不是企业 BI，也不是再做一张漂亮看板，而是给跨境电商小团队、平台卖家、外贸 SOHO 和广交会参展商一个能直接追问经营数据的工作台。</ns0:t>
+      </ns0:r>
+    </ns0:p>
+    <ns0:p>
+      <ns0:pPr>
+        <ns0:spacing ns0:after="120" ns0:line="276" ns0:lineRule="auto"/>
+      </ns0:pPr>
+      <ns0:r>
+        <ns0:rPr>
+          <ns0:rFonts ns0:ascii="Arial" ns0:hAnsi="Arial" ns0:eastAsia="Microsoft YaHei"/>
+        </ns0:rPr>
+        <ns0:t>这个场景很具体：很多小团队有订单导出、商品表、渠道数据和地区数据，但没有专职分析师。老板想知道哪个地区值得投放、哪些品类适合组合推荐、复购用户下一步可能买什么，通常只能靠表格、经验和临时报表。QueryForge 把这些问题变成可以执行、可以复盘的查询和建议。</ns0:t>
+      </ns0:r>
+    </ns0:p>
+    <ns0:p>
+      <ns0:pPr>
+        <ns0:spacing ns0:after="120" ns0:line="276" ns0:lineRule="auto"/>
+      </ns0:pPr>
+      <ns0:r>
+        <ns0:rPr>
+          <ns0:rFonts ns0:ascii="Arial" ns0:hAnsi="Arial" ns0:eastAsia="Microsoft YaHei"/>
+        </ns0:rPr>
+        <ns0:t>今天使用的是公开真实数据。我们接入 Kaggle 上的 Olist Brazilian E-Commerce Public Dataset，约 10 万笔巴西电商订单，包含订单状态、价格、支付、客户位置、商品属性和评价。巴西案例和跨境电商场景是匹配的：区域、品类、支付方式、复购和客单价都能形成真实经营问题。</ns0:t>
+      </ns0:r>
+    </ns0:p>
+    <ns0:p>
+      <ns0:pPr>
+        <ns0:spacing ns0:after="120" ns0:line="276" ns0:lineRule="auto"/>
+      </ns0:pPr>
+      <ns0:r>
+        <ns0:rPr>
+          <ns0:rFonts ns0:ascii="Arial" ns0:hAnsi="Arial" ns0:eastAsia="Microsoft YaHei"/>
+        </ns0:rPr>
+        <ns0:t>商业上，我们不把它讲成按年或按席位采购的软件。更现实的路径是个人开发者推出一款实用小工具：macOS 本地应用一次买断，用户自带模型供应商的 API key/token。建议首发价格带是 128 到 168 元，用广交会地推、卖家微信群、培训社群和服务商渠道验证冲动购买和真实转化。</ns0:t>
+      </ns0:r>
+    </ns0:p>
+    <ns0:p>
+      <ns0:pPr>
+        <ns0:pStyle ns0:val="Heading1"/>
+      </ns0:pPr>
+      <ns0:r>
+        <ns0:rPr>
+          <ns0:rFonts ns0:ascii="Arial" ns0:hAnsi="Arial" ns0:eastAsia="Microsoft YaHei"/>
+        </ns0:rPr>
+        <ns0:t>Eric｜开发阐述（约 2 分钟）</ns0:t>
+      </ns0:r>
+    </ns0:p>
+    <ns0:p>
+      <ns0:pPr>
+        <ns0:spacing ns0:after="120" ns0:line="276" ns0:lineRule="auto"/>
+      </ns0:pPr>
+      <ns0:r>
+        <ns0:rPr>
+          <ns0:rFonts ns0:ascii="Arial" ns0:hAnsi="Arial" ns0:eastAsia="Microsoft YaHei"/>
+        </ns0:rPr>
+        <ns0:t>我讲技术实现。QueryForge 的关键不是把 SQL 生成外包给模型，而是做一层本地 harness：模型在受控边界内工作，数据库和凭据留在本机。</ns0:t>
+      </ns0:r>
+    </ns0:p>
+    <ns0:p>
+      <ns0:pPr>
+        <ns0:spacing ns0:after="120" ns0:line="276" ns0:lineRule="auto"/>
+      </ns0:pPr>
+      <ns0:r>
+        <ns0:rPr>
+          <ns0:rFonts ns0:ascii="Arial" ns0:hAnsi="Arial" ns0:eastAsia="Microsoft YaHei"/>
+        </ns0:rPr>
+        <ns0:t>第一层是本地数据平面。桌面版自带 SQLite demo 数据，也可以扩展到用户自己的结构化经营数据。Settings 下拉菜单可以自助填写 OpenAI-compatible endpoint、model、API key/token 和月度 token 预算；这些配置保存在本机应用支持目录，不进入 GitHub，也不放到 Railway。</ns0:t>
+      </ns0:r>
+    </ns0:p>
+    <ns0:p>
+      <ns0:pPr>
+        <ns0:spacing ns0:after="120" ns0:line="276" ns0:lineRule="auto"/>
+      </ns0:pPr>
+      <ns0:r>
+        <ns0:rPr>
+          <ns0:rFonts ns0:ascii="Arial" ns0:hAnsi="Arial" ns0:eastAsia="Microsoft YaHei"/>
+        </ns0:rPr>
+        <ns0:t>第二层是 Agent 循环。用户用中文提问，系统把问题、schema 和上下文交给外部模型生成候选 SQL；再用 AST 做只读校验，只允许单条 SELECT，限制敏感字段和通配查询，并自动补 LIMIT；执行结果回填给模型生成图表配置和经营解释。</ns0:t>
+      </ns0:r>
+    </ns0:p>
+    <ns0:p>
+      <ns0:pPr>
+        <ns0:spacing ns0:after="120" ns0:line="276" ns0:lineRule="auto"/>
+      </ns0:pPr>
+      <ns0:r>
+        <ns0:rPr>
+          <ns0:rFonts ns0:ascii="Arial" ns0:hAnsi="Arial" ns0:eastAsia="Microsoft YaHei"/>
+        </ns0:rPr>
+        <ns0:t>第三层是演示边界。Railway 线上页面保留为手机扫码 demo，使用 Olist 和稳定预设答案，方便评委手机查看。真实产品路径是 macOS 桌面端：本机凭据、本地 token plan、真实 provider API 调用、SQL 执行和结果 grounding 都在本机完成。</ns0:t>
+      </ns0:r>
+    </ns0:p>
+    <ns0:p>
+      <ns0:pPr>
+        <ns0:spacing ns0:after="120" ns0:line="276" ns0:lineRule="auto"/>
+      </ns0:pPr>
+      <ns0:r>
+        <ns0:rPr>
+          <ns0:rFonts ns0:ascii="Arial" ns0:hAnsi="Arial" ns0:eastAsia="Microsoft YaHei"/>
+        </ns0:rPr>
+        <ns0:t>为什么这里必须引入 Agent？因为经营分析不是一次 SQL 翻译。用户会追问原因、比较地区、拆品类、问下一步动作。QueryForge 把模型能力放进一个可检查流程：理解问题、生成 SQL、验证、执行、解释、保存指标，并把每次调用计入 token 预算。</ns0:t>
+      </ns0:r>
+    </ns0:p>
+    <ns0:p>
+      <ns0:pPr>
+        <ns0:pStyle ns0:val="Heading1"/>
+      </ns0:pPr>
+      <ns0:r>
+        <ns0:rPr>
+          <ns0:rFonts ns0:ascii="Arial" ns0:hAnsi="Arial" ns0:eastAsia="Microsoft YaHei"/>
+        </ns0:rPr>
+        <ns0:t>Mavis｜收束（约 40 秒）</ns0:t>
+      </ns0:r>
+    </ns0:p>
+    <ns0:p>
+      <ns0:pPr>
+        <ns0:spacing ns0:after="120" ns0:line="276" ns0:lineRule="auto"/>
+      </ns0:pPr>
+      <ns0:r>
+        <ns0:rPr>
+          <ns0:rFonts ns0:ascii="Arial" ns0:hAnsi="Arial" ns0:eastAsia="Microsoft YaHei"/>
+        </ns0:rPr>
+        <ns0:t>所以 QueryForge 的定位是：让没有专职分析师的小微电商团队，也能围绕自己的订单和商品数据做专业经营分析。它不卖模型能力，而是卖一个把模型、数据库和经营问题连接起来的本地工作台。</ns0:t>
+      </ns0:r>
+    </ns0:p>
+    <ns0:p>
+      <ns0:pPr>
+        <ns0:spacing ns0:after="120" ns0:line="276" ns0:lineRule="auto"/>
+      </ns0:pPr>
+      <ns0:r>
+        <ns0:rPr>
+          <ns0:rFonts ns0:ascii="Arial" ns0:hAnsi="Arial" ns0:eastAsia="Microsoft YaHei"/>
+        </ns0:rPr>
+        <ns0:t>从 hackathon 到可售产品，第一步是把 macOS 桌面端打磨到稳定可用：Settings 配置、数据导入、只读查询、图表和问答体验；第二步做 App Store 或网站买断分发；第三步再根据真实用户反馈补 CSV/Excel 导入、更多平台模板和轻量报表导出。</ns0:t>
+      </ns0:r>
+    </ns0:p>
+    <ns0:p>
+      <ns0:pPr>
+        <ns0:pStyle ns0:val="Heading1"/>
+      </ns0:pPr>
+      <ns0:r>
+        <ns0:rPr>
+          <ns0:rFonts ns0:ascii="Arial" ns0:hAnsi="Arial" ns0:eastAsia="Microsoft YaHei"/>
+        </ns0:rPr>
+        <ns0:t>演示流程</ns0:t>
+      </ns0:r>
+    </ns0:p>
+    <ns0:p>
+      <ns0:pPr>
+        <ns0:spacing ns0:after="120" ns0:line="276" ns0:lineRule="auto"/>
+      </ns0:pPr>
+      <ns0:r>
+        <ns0:rPr>
+          <ns0:rFonts ns0:ascii="Arial" ns0:hAnsi="Arial" ns0:eastAsia="Microsoft YaHei"/>
+        </ns0:rPr>
+        <ns0:t>打开页面，先让评委看到 KPI：99,441 订单、R$1,601 万营收、96,096 用户、74 品类。</ns0:t>
+      </ns0:r>
+    </ns0:p>
+    <ns0:p>
+      <ns0:pPr>
+        <ns0:spacing ns0:after="120" ns0:line="276" ns0:lineRule="auto"/>
+      </ns0:pPr>
+      <ns0:r>
+        <ns0:rPr>
+          <ns0:rFonts ns0:ascii="Arial" ns0:hAnsi="Arial" ns0:eastAsia="Microsoft YaHei"/>
+        </ns0:rPr>
+        <ns0:t>点击「哪个地区最值得优先投放？」或「哪些品类适合做组合推荐？」，展示图表、SQL 和分析报告。</ns0:t>
+      </ns0:r>
+    </ns0:p>
+    <ns0:p>
+      <ns0:pPr>
+        <ns0:spacing ns0:after="120" ns0:line="276" ns0:lineRule="auto"/>
+      </ns0:pPr>
+      <ns0:r>
+        <ns0:rPr>
+          <ns0:rFonts ns0:ascii="Arial" ns0:hAnsi="Arial" ns0:eastAsia="Microsoft YaHei"/>
+        </ns0:rPr>
+        <ns0:t>再点「复购用户的品类跨越路径」，强调它不是静态看板，而是经营问题驱动的查询。</ns0:t>
+      </ns0:r>
+    </ns0:p>
+    <ns0:p>
+      <ns0:pPr>
+        <ns0:spacing ns0:after="120" ns0:line="276" ns0:lineRule="auto"/>
+      </ns0:pPr>
+      <ns0:r>
+        <ns0:rPr>
+          <ns0:rFonts ns0:ascii="Arial" ns0:hAnsi="Arial" ns0:eastAsia="Microsoft YaHei"/>
+        </ns0:rPr>
+        <ns0:t>如果演示桌面端，打开 Settings 下拉菜单，说明 endpoint、model、API key/token 和 token budget 都由用户本机填写。</ns0:t>
+      </ns0:r>
+    </ns0:p>
+    <ns0:p>
+      <ns0:pPr>
+        <ns0:spacing ns0:after="120" ns0:line="276" ns0:lineRule="auto"/>
+      </ns0:pPr>
+      <ns0:r>
+        <ns0:rPr>
+          <ns0:rFonts ns0:ascii="Arial" ns0:hAnsi="Arial" ns0:eastAsia="Microsoft YaHei"/>
+        </ns0:rPr>
+        <ns0:t>如果现场网络或 provider 不稳定，Railway 扫码页只作为公开 demo，直接使用预设问题保持演示流畅。</ns0:t>
+      </ns0:r>
+    </ns0:p>
+    <ns0:p>
+      <ns0:pPr>
+        <ns0:pStyle ns0:val="Heading1"/>
+      </ns0:pPr>
+      <ns0:r>
+        <ns0:rPr>
+          <ns0:rFonts ns0:ascii="Arial" ns0:hAnsi="Arial" ns0:eastAsia="Microsoft YaHei"/>
+        </ns0:rPr>
+        <ns0:t>Q&amp;A 预案</ns0:t>
+      </ns0:r>
+    </ns0:p>
+    <ns0:p>
+      <ns0:pPr>
+        <ns0:spacing ns0:after="120" ns0:line="276" ns0:lineRule="auto"/>
+      </ns0:pPr>
+      <ns0:r>
+        <ns0:rPr>
+          <ns0:rFonts ns0:ascii="Arial" ns0:hAnsi="Arial" ns0:eastAsia="Microsoft YaHei"/>
+        </ns0:rPr>
+        <ns0:t>Q: 和普通 BI 看板有什么区别？ A: 看板回答固定问题；QueryForge 支持围绕经营问题连续追问，并把问题落到 SQL、图表和结果解释上。</ns0:t>
+      </ns0:r>
+    </ns0:p>
+    <ns0:p>
+      <ns0:pPr>
+        <ns0:spacing ns0:after="120" ns0:line="276" ns0:lineRule="auto"/>
+      </ns0:pPr>
+      <ns0:r>
+        <ns0:rPr>
+          <ns0:rFonts ns0:ascii="Arial" ns0:hAnsi="Arial" ns0:eastAsia="Microsoft YaHei"/>
+        </ns0:rPr>
+        <ns0:t>Q: 和直接问大模型有什么区别？ A: 大模型默认没有数据库执行权、指标口径和查询记录。QueryForge 把模型放进本地 harness，让它看 schema、生成只读 SQL、执行查询，并基于真实结果回答。</ns0:t>
+      </ns0:r>
+    </ns0:p>
+    <ns0:p>
+      <ns0:pPr>
+        <ns0:spacing ns0:after="120" ns0:line="276" ns0:lineRule="auto"/>
+      </ns0:pPr>
+      <ns0:r>
+        <ns0:rPr>
+          <ns0:rFonts ns0:ascii="Arial" ns0:hAnsi="Arial" ns0:eastAsia="Microsoft YaHei"/>
+        </ns0:rPr>
+        <ns0:t>Q: 数据真实吗？ A: 是 Kaggle Olist 公开电商数据集，约 10 万笔真实匿名商业订单。它是 demo case，不限制产品只能做巴西或电商数据。</ns0:t>
+      </ns0:r>
+    </ns0:p>
+    <ns0:p>
+      <ns0:pPr>
+        <ns0:spacing ns0:after="120" ns0:line="276" ns0:lineRule="auto"/>
+      </ns0:pPr>
+      <ns0:r>
+        <ns0:rPr>
+          <ns0:rFonts ns0:ascii="Arial" ns0:hAnsi="Arial" ns0:eastAsia="Microsoft YaHei"/>
+        </ns0:rPr>
+        <ns0:t>Q: 大模型幻觉怎么办？ A: 不让模型成为权威。它生成候选 SQL，系统用 schema、AST 只读校验、数据库执行结果和二次解释约束它。</ns0:t>
+      </ns0:r>
+    </ns0:p>
+    <ns0:p>
+      <ns0:pPr>
+        <ns0:spacing ns0:after="120" ns0:line="276" ns0:lineRule="auto"/>
+      </ns0:pPr>
+      <ns0:r>
+        <ns0:rPr>
+          <ns0:rFonts ns0:ascii="Arial" ns0:hAnsi="Arial" ns0:eastAsia="Microsoft YaHei"/>
+        </ns0:rPr>
+        <ns0:t>Q: 怎么商业化？ A: 更现实的是一次性买断小工具，首发价格带 128 到 168 元。目标用户是跨境电商小团队、平台卖家、外贸 SOHO 和广交会参展商，模型 token 由用户自己的 provider key 承担。</ns0:t>
+      </ns0:r>
+    </ns0:p>
+    <ns0:p>
+      <ns0:r>
+        <ns0:rPr>
+          <ns0:rFonts ns0:ascii="Arial" ns0:hAnsi="Arial" ns0:eastAsia="Microsoft YaHei"/>
+          <ns0:b/>
+        </ns0:rPr>
+        <ns0:t>措辞参考：Kaggle/Olist 数据集说明；Gartner Data &amp; Analytics；Tableau modern BI；IBM self-service analytics；Dun &amp; Bradstreet trusted business data；公开报道中的广交会跨境电商展区和中小微卖家生态。</ns0:t>
+      </ns0:r>
+    </ns0:p>
+    <ns0:sectPr ns0:rsidR="00FC693F" ns0:rsidRPr="0006063C" ns0:rsidSect="00034616">
+      <ns0:pgSz ns0:w="12240" ns0:h="15840"/>
+      <ns0:pgMar ns0:top="1080" ns0:right="1080" ns0:bottom="1080" ns0:left="1080" ns0:header="720" ns0:footer="720" ns0:gutter="0"/>
+      <ns0:cols ns0:space="720"/>
+      <ns0:docGrid ns0:linePitch="360"/>
+    </ns0:sectPr>
+  </ns0:body>
+</ns0:document>
 </file>
 
 <file path=word/numbering.xml><?xml version="1.0" encoding="utf-8"?>

</xml_diff>

<commit_message>
Prepare local desktop release
</commit_message>
<xml_diff>
--- a/assets/speaker-notes.docx
+++ b/assets/speaker-notes.docx
@@ -5,12 +5,14 @@
     <ns0:p>
       <ns0:pPr>
         <ns0:jc ns0:val="center"/>
+        <ns0:spacing ns0:before="0" ns0:after="240" ns0:line="312" ns0:lineRule="auto"/>
       </ns0:pPr>
       <ns0:r>
         <ns0:rPr>
           <ns0:rFonts ns0:ascii="Arial" ns0:hAnsi="Arial" ns0:eastAsia="Microsoft YaHei"/>
+          <ns0:sz ns0:val="36"/>
+          <ns0:color ns0:val="000000"/>
           <ns0:b/>
-          <ns0:sz ns0:val="36"/>
         </ns0:rPr>
         <ns0:t>QueryForge 路演讲稿（双人版）</ns0:t>
       </ns0:r>
@@ -18,307 +20,228 @@
     <ns0:p>
       <ns0:pPr>
         <ns0:jc ns0:val="center"/>
+        <ns0:spacing ns0:before="80" ns0:after="180" ns0:line="312" ns0:lineRule="auto"/>
       </ns0:pPr>
       <ns0:r>
         <ns0:rPr>
           <ns0:rFonts ns0:ascii="Arial" ns0:hAnsi="Arial" ns0:eastAsia="Microsoft YaHei"/>
+          <ns0:sz ns0:val="22"/>
+          <ns0:color ns0:val="111111"/>
         </ns0:rPr>
-        <ns0:t>分工：Mavis 负责商业叙事，Eric 负责开发与技术可信度。5 分钟演示 + 3 分钟 Q&amp;A，可按现场时间删减。</ns0:t>
+        <ns0:t>分工：Mavis 负责商业叙事，Eric 负责开发与技术可信度。主讲稿控制在 3 分钟内，Q&amp;A 只使用备用短答。</ns0:t>
       </ns0:r>
     </ns0:p>
     <ns0:p>
       <ns0:pPr>
-        <ns0:pStyle ns0:val="Heading1"/>
+        <ns0:spacing ns0:before="220" ns0:after="80" ns0:line="312" ns0:lineRule="auto"/>
       </ns0:pPr>
       <ns0:r>
         <ns0:rPr>
           <ns0:rFonts ns0:ascii="Arial" ns0:hAnsi="Arial" ns0:eastAsia="Microsoft YaHei"/>
+          <ns0:sz ns0:val="26"/>
+          <ns0:color ns0:val="2F5F9A"/>
+          <ns0:b/>
         </ns0:rPr>
-        <ns0:t>Mavis｜商业叙述（约 2 分钟）</ns0:t>
+        <ns0:t>Mavis｜0:00-1:05 商业场景</ns0:t>
       </ns0:r>
     </ns0:p>
     <ns0:p>
       <ns0:pPr>
-        <ns0:spacing ns0:after="120" ns0:line="276" ns0:lineRule="auto"/>
+        <ns0:spacing ns0:after="100" ns0:line="312" ns0:lineRule="auto" ns0:before="80"/>
       </ns0:pPr>
       <ns0:r>
         <ns0:rPr>
           <ns0:rFonts ns0:ascii="Arial" ns0:hAnsi="Arial" ns0:eastAsia="Microsoft YaHei"/>
+          <ns0:sz ns0:val="22"/>
+          <ns0:color ns0:val="111111"/>
         </ns0:rPr>
-        <ns0:t>大家好，我们做的是 QueryForge，一个让电商经营者获得专业数据分析能力的本地分析工具。它不是企业 BI，也不是再做一张漂亮看板，而是给跨境电商小团队、平台卖家、外贸 SOHO 和广交会参展商一个能直接追问经营数据的工作台。</ns0:t>
+        <ns0:t>大家好，我们做的是 QueryForge，一个面向小微电商经营者的本地优先分析工具包。今天展示的是第一个工具：订单与经营分析 workbench。目标用户不是大企业 BI 团队，而是跨境卖家、外贸 SOHO、广交会参展商，以及几个人规模的 Amazon、独立站和平台卖家。他们有订单、商品、渠道、地区数据，却没有专职分析师；想问哪个市场值得投放、哪些品类能组合销售、复购用户下一步可能买什么，通常只能靠 Excel 和经验。QueryForge 把这些经营问题直接变成 SQL、图表和建议。今天用 Kaggle/Olist 巴西真实电商数据做 demo，因为它有 99,441 笔订单、5 个地区和 74 个品类，足够模拟真实跨境电商分析场景。</ns0:t>
       </ns0:r>
     </ns0:p>
     <ns0:p>
       <ns0:pPr>
-        <ns0:spacing ns0:after="120" ns0:line="276" ns0:lineRule="auto"/>
+        <ns0:spacing ns0:after="80" ns0:line="312" ns0:lineRule="auto" ns0:before="220"/>
       </ns0:pPr>
       <ns0:r>
         <ns0:rPr>
           <ns0:rFonts ns0:ascii="Arial" ns0:hAnsi="Arial" ns0:eastAsia="Microsoft YaHei"/>
+          <ns0:sz ns0:val="26"/>
+          <ns0:color ns0:val="2F5F9A"/>
+          <ns0:b/>
         </ns0:rPr>
-        <ns0:t>这个场景很具体：很多小团队有订单导出、商品表、渠道数据和地区数据，但没有专职分析师。老板想知道哪个地区值得投放、哪些品类适合组合推荐、复购用户下一步可能买什么，通常只能靠表格、经验和临时报表。QueryForge 把这些问题变成可以执行、可以复盘的查询和建议。</ns0:t>
+        <ns0:t>Eric｜1:05-2:15 技术实现</ns0:t>
       </ns0:r>
     </ns0:p>
     <ns0:p>
       <ns0:pPr>
-        <ns0:spacing ns0:after="120" ns0:line="276" ns0:lineRule="auto"/>
+        <ns0:spacing ns0:after="100" ns0:line="312" ns0:lineRule="auto" ns0:before="80"/>
       </ns0:pPr>
       <ns0:r>
         <ns0:rPr>
           <ns0:rFonts ns0:ascii="Arial" ns0:hAnsi="Arial" ns0:eastAsia="Microsoft YaHei"/>
+          <ns0:sz ns0:val="22"/>
+          <ns0:color ns0:val="111111"/>
         </ns0:rPr>
-        <ns0:t>今天使用的是公开真实数据。我们接入 Kaggle 上的 Olist Brazilian E-Commerce Public Dataset，约 10 万笔巴西电商订单，包含订单状态、价格、支付、客户位置、商品属性和评价。巴西案例和跨境电商场景是匹配的：区域、品类、支付方式、复购和客单价都能形成真实经营问题。</ns0:t>
+        <ns0:t>技术上，QueryForge 不是把问题丢给模型聊天，而是在本地做一层 harness。数据、API key 和 token 预算留在用户机器；模型服务由用户自己配置，可以接 DeepSeek、Kimi、OpenAI、Anthropic 或其他常见 provider。系统把问题、schema 和上下文交给模型生成候选 SQL，再用 AST 做只读校验，只允许 SELECT；执行后把真实结果回填给模型生成解释。这样回答有数据库依据，也能连续追问。Railway 扫码页只是手机公开 demo；真正产品路径是本地桌面应用。当前因为开发设备是 Mac，所以用 macOS 包展示，但产品不绑定 Mac，后续可以提供 Windows 和 macOS 预编译二进制包。</ns0:t>
       </ns0:r>
     </ns0:p>
     <ns0:p>
       <ns0:pPr>
-        <ns0:spacing ns0:after="120" ns0:line="276" ns0:lineRule="auto"/>
+        <ns0:spacing ns0:after="80" ns0:line="312" ns0:lineRule="auto" ns0:before="220"/>
       </ns0:pPr>
       <ns0:r>
         <ns0:rPr>
           <ns0:rFonts ns0:ascii="Arial" ns0:hAnsi="Arial" ns0:eastAsia="Microsoft YaHei"/>
+          <ns0:sz ns0:val="26"/>
+          <ns0:color ns0:val="2F5F9A"/>
+          <ns0:b/>
         </ns0:rPr>
-        <ns0:t>商业上，我们不把它讲成按年或按席位采购的软件。更现实的路径是个人开发者推出一款实用小工具：macOS 本地应用一次买断，用户自带模型供应商的 API key/token。建议首发价格带是 128 到 168 元，用广交会地推、卖家微信群、培训社群和服务商渠道验证冲动购买和真实转化。</ns0:t>
+        <ns0:t>Mavis｜2:15-3:00 商业收束</ns0:t>
       </ns0:r>
     </ns0:p>
     <ns0:p>
       <ns0:pPr>
-        <ns0:pStyle ns0:val="Heading1"/>
+        <ns0:spacing ns0:before="80" ns0:after="100" ns0:line="312" ns0:lineRule="auto"/>
       </ns0:pPr>
       <ns0:r>
         <ns0:rPr>
           <ns0:rFonts ns0:ascii="Arial" ns0:hAnsi="Arial" ns0:eastAsia="Microsoft YaHei"/>
+          <ns0:sz ns0:val="22"/>
+          <ns0:color ns0:val="111111"/>
         </ns0:rPr>
-        <ns0:t>Eric｜开发阐述（约 2 分钟）</ns0:t>
+        <ns0:t>商业路径也按小微企业购买习惯设计。QueryForge 不卖模型 token，也不走重型按席位 SaaS；它更像一个闭源软件服务包，可以在官网、渠道、卖家社群、培训课或广交会地推里销售预编译软件，由用户自带模型 key，成本边界清楚。第一个工具先解决经营分析，后续扩展数据导入、平台模板和报表导出。它和直接问大模型的差异在于：能连接本机数据、执行查询、复盘指标口径，并控制调用成本。接下来演示三件事：看 KPI，点预设经营问题，再在本地 Settings 配置 provider key 后自然追问。</ns0:t>
       </ns0:r>
     </ns0:p>
     <ns0:p>
       <ns0:pPr>
-        <ns0:spacing ns0:after="120" ns0:line="276" ns0:lineRule="auto"/>
+        <ns0:spacing ns0:after="80" ns0:line="312" ns0:lineRule="auto" ns0:before="220"/>
       </ns0:pPr>
       <ns0:r>
         <ns0:rPr>
           <ns0:rFonts ns0:ascii="Arial" ns0:hAnsi="Arial" ns0:eastAsia="Microsoft YaHei"/>
-        </ns0:rPr>
-        <ns0:t>我讲技术实现。QueryForge 的关键不是把 SQL 生成外包给模型，而是做一层本地 harness：模型在受控边界内工作，数据库和凭据留在本机。</ns0:t>
-      </ns0:r>
-    </ns0:p>
-    <ns0:p>
-      <ns0:pPr>
-        <ns0:spacing ns0:after="120" ns0:line="276" ns0:lineRule="auto"/>
-      </ns0:pPr>
-      <ns0:r>
-        <ns0:rPr>
-          <ns0:rFonts ns0:ascii="Arial" ns0:hAnsi="Arial" ns0:eastAsia="Microsoft YaHei"/>
-        </ns0:rPr>
-        <ns0:t>第一层是本地数据平面。桌面版自带 SQLite demo 数据，也可以扩展到用户自己的结构化经营数据。Settings 下拉菜单可以自助填写 OpenAI-compatible endpoint、model、API key/token 和月度 token 预算；这些配置保存在本机应用支持目录，不进入 GitHub，也不放到 Railway。</ns0:t>
-      </ns0:r>
-    </ns0:p>
-    <ns0:p>
-      <ns0:pPr>
-        <ns0:spacing ns0:after="120" ns0:line="276" ns0:lineRule="auto"/>
-      </ns0:pPr>
-      <ns0:r>
-        <ns0:rPr>
-          <ns0:rFonts ns0:ascii="Arial" ns0:hAnsi="Arial" ns0:eastAsia="Microsoft YaHei"/>
-        </ns0:rPr>
-        <ns0:t>第二层是 Agent 循环。用户用中文提问，系统把问题、schema 和上下文交给外部模型生成候选 SQL；再用 AST 做只读校验，只允许单条 SELECT，限制敏感字段和通配查询，并自动补 LIMIT；执行结果回填给模型生成图表配置和经营解释。</ns0:t>
-      </ns0:r>
-    </ns0:p>
-    <ns0:p>
-      <ns0:pPr>
-        <ns0:spacing ns0:after="120" ns0:line="276" ns0:lineRule="auto"/>
-      </ns0:pPr>
-      <ns0:r>
-        <ns0:rPr>
-          <ns0:rFonts ns0:ascii="Arial" ns0:hAnsi="Arial" ns0:eastAsia="Microsoft YaHei"/>
-        </ns0:rPr>
-        <ns0:t>第三层是演示边界。Railway 线上页面保留为手机扫码 demo，使用 Olist 和稳定预设答案，方便评委手机查看。真实产品路径是 macOS 桌面端：本机凭据、本地 token plan、真实 provider API 调用、SQL 执行和结果 grounding 都在本机完成。</ns0:t>
-      </ns0:r>
-    </ns0:p>
-    <ns0:p>
-      <ns0:pPr>
-        <ns0:spacing ns0:after="120" ns0:line="276" ns0:lineRule="auto"/>
-      </ns0:pPr>
-      <ns0:r>
-        <ns0:rPr>
-          <ns0:rFonts ns0:ascii="Arial" ns0:hAnsi="Arial" ns0:eastAsia="Microsoft YaHei"/>
-        </ns0:rPr>
-        <ns0:t>为什么这里必须引入 Agent？因为经营分析不是一次 SQL 翻译。用户会追问原因、比较地区、拆品类、问下一步动作。QueryForge 把模型能力放进一个可检查流程：理解问题、生成 SQL、验证、执行、解释、保存指标，并把每次调用计入 token 预算。</ns0:t>
-      </ns0:r>
-    </ns0:p>
-    <ns0:p>
-      <ns0:pPr>
-        <ns0:pStyle ns0:val="Heading1"/>
-      </ns0:pPr>
-      <ns0:r>
-        <ns0:rPr>
-          <ns0:rFonts ns0:ascii="Arial" ns0:hAnsi="Arial" ns0:eastAsia="Microsoft YaHei"/>
-        </ns0:rPr>
-        <ns0:t>Mavis｜收束（约 40 秒）</ns0:t>
-      </ns0:r>
-    </ns0:p>
-    <ns0:p>
-      <ns0:pPr>
-        <ns0:spacing ns0:after="120" ns0:line="276" ns0:lineRule="auto"/>
-      </ns0:pPr>
-      <ns0:r>
-        <ns0:rPr>
-          <ns0:rFonts ns0:ascii="Arial" ns0:hAnsi="Arial" ns0:eastAsia="Microsoft YaHei"/>
-        </ns0:rPr>
-        <ns0:t>所以 QueryForge 的定位是：让没有专职分析师的小微电商团队，也能围绕自己的订单和商品数据做专业经营分析。它不卖模型能力，而是卖一个把模型、数据库和经营问题连接起来的本地工作台。</ns0:t>
-      </ns0:r>
-    </ns0:p>
-    <ns0:p>
-      <ns0:pPr>
-        <ns0:spacing ns0:after="120" ns0:line="276" ns0:lineRule="auto"/>
-      </ns0:pPr>
-      <ns0:r>
-        <ns0:rPr>
-          <ns0:rFonts ns0:ascii="Arial" ns0:hAnsi="Arial" ns0:eastAsia="Microsoft YaHei"/>
-        </ns0:rPr>
-        <ns0:t>从 hackathon 到可售产品，第一步是把 macOS 桌面端打磨到稳定可用：Settings 配置、数据导入、只读查询、图表和问答体验；第二步做 App Store 或网站买断分发；第三步再根据真实用户反馈补 CSV/Excel 导入、更多平台模板和轻量报表导出。</ns0:t>
-      </ns0:r>
-    </ns0:p>
-    <ns0:p>
-      <ns0:pPr>
-        <ns0:pStyle ns0:val="Heading1"/>
-      </ns0:pPr>
-      <ns0:r>
-        <ns0:rPr>
-          <ns0:rFonts ns0:ascii="Arial" ns0:hAnsi="Arial" ns0:eastAsia="Microsoft YaHei"/>
+          <ns0:sz ns0:val="26"/>
+          <ns0:color ns0:val="2F5F9A"/>
+          <ns0:b/>
         </ns0:rPr>
         <ns0:t>演示流程</ns0:t>
       </ns0:r>
     </ns0:p>
     <ns0:p>
       <ns0:pPr>
-        <ns0:spacing ns0:after="120" ns0:line="276" ns0:lineRule="auto"/>
+        <ns0:spacing ns0:after="100" ns0:line="312" ns0:lineRule="auto" ns0:before="80"/>
       </ns0:pPr>
       <ns0:r>
         <ns0:rPr>
           <ns0:rFonts ns0:ascii="Arial" ns0:hAnsi="Arial" ns0:eastAsia="Microsoft YaHei"/>
+          <ns0:sz ns0:val="22"/>
+          <ns0:color ns0:val="111111"/>
         </ns0:rPr>
-        <ns0:t>打开页面，先让评委看到 KPI：99,441 订单、R$1,601 万营收、96,096 用户、74 品类。</ns0:t>
+        <ns0:t>1. 先展示 KPI：99,441 订单、R$1,601 万营收、96,096 用户、74 品类、5 地区。</ns0:t>
       </ns0:r>
     </ns0:p>
     <ns0:p>
       <ns0:pPr>
-        <ns0:spacing ns0:after="120" ns0:line="276" ns0:lineRule="auto"/>
+        <ns0:spacing ns0:after="100" ns0:line="312" ns0:lineRule="auto" ns0:before="80"/>
       </ns0:pPr>
       <ns0:r>
         <ns0:rPr>
           <ns0:rFonts ns0:ascii="Arial" ns0:hAnsi="Arial" ns0:eastAsia="Microsoft YaHei"/>
+          <ns0:sz ns0:val="22"/>
+          <ns0:color ns0:val="111111"/>
         </ns0:rPr>
-        <ns0:t>点击「哪个地区最值得优先投放？」或「哪些品类适合做组合推荐？」，展示图表、SQL 和分析报告。</ns0:t>
+        <ns0:t>2. 点击「哪个地区最值得优先投放？」或「哪些品类适合做组合推荐？」展示 SQL、图表和建议。</ns0:t>
       </ns0:r>
     </ns0:p>
     <ns0:p>
       <ns0:pPr>
-        <ns0:spacing ns0:after="120" ns0:line="276" ns0:lineRule="auto"/>
+        <ns0:spacing ns0:after="100" ns0:line="312" ns0:lineRule="auto" ns0:before="80"/>
       </ns0:pPr>
       <ns0:r>
         <ns0:rPr>
           <ns0:rFonts ns0:ascii="Arial" ns0:hAnsi="Arial" ns0:eastAsia="Microsoft YaHei"/>
+          <ns0:sz ns0:val="22"/>
+          <ns0:color ns0:val="111111"/>
         </ns0:rPr>
-        <ns0:t>再点「复购用户的品类跨越路径」，强调它不是静态看板，而是经营问题驱动的查询。</ns0:t>
+        <ns0:t>3. 展示 Settings：用户本机选择 provider、填写 API key/token；URL、model 和预算在高级设置。</ns0:t>
       </ns0:r>
     </ns0:p>
     <ns0:p>
       <ns0:pPr>
-        <ns0:spacing ns0:after="120" ns0:line="276" ns0:lineRule="auto"/>
+        <ns0:spacing ns0:after="100" ns0:line="312" ns0:lineRule="auto" ns0:before="80"/>
       </ns0:pPr>
       <ns0:r>
         <ns0:rPr>
           <ns0:rFonts ns0:ascii="Arial" ns0:hAnsi="Arial" ns0:eastAsia="Microsoft YaHei"/>
+          <ns0:sz ns0:val="22"/>
+          <ns0:color ns0:val="111111"/>
         </ns0:rPr>
-        <ns0:t>如果演示桌面端，打开 Settings 下拉菜单，说明 endpoint、model、API key/token 和 token budget 都由用户本机填写。</ns0:t>
+        <ns0:t>4. 如果现场网络不稳，Railway 扫码页使用预设问题保证路演不断。</ns0:t>
       </ns0:r>
     </ns0:p>
     <ns0:p>
       <ns0:pPr>
-        <ns0:spacing ns0:after="120" ns0:line="276" ns0:lineRule="auto"/>
+        <ns0:spacing ns0:before="220" ns0:after="80" ns0:line="312" ns0:lineRule="auto"/>
       </ns0:pPr>
       <ns0:r>
         <ns0:rPr>
           <ns0:rFonts ns0:ascii="Arial" ns0:hAnsi="Arial" ns0:eastAsia="Microsoft YaHei"/>
+          <ns0:sz ns0:val="26"/>
+          <ns0:color ns0:val="2F5F9A"/>
+          <ns0:b/>
         </ns0:rPr>
-        <ns0:t>如果现场网络或 provider 不稳定，Railway 扫码页只作为公开 demo，直接使用预设问题保持演示流畅。</ns0:t>
+        <ns0:t>备用短答</ns0:t>
       </ns0:r>
     </ns0:p>
     <ns0:p>
       <ns0:pPr>
-        <ns0:pStyle ns0:val="Heading1"/>
+        <ns0:spacing ns0:after="100" ns0:line="312" ns0:lineRule="auto" ns0:before="80"/>
       </ns0:pPr>
       <ns0:r>
         <ns0:rPr>
           <ns0:rFonts ns0:ascii="Arial" ns0:hAnsi="Arial" ns0:eastAsia="Microsoft YaHei"/>
+          <ns0:sz ns0:val="22"/>
+          <ns0:color ns0:val="111111"/>
         </ns0:rPr>
-        <ns0:t>Q&amp;A 预案</ns0:t>
+        <ns0:t>和直接问大模型的区别：QueryForge 有本机数据执行链路、只读 SQL 校验、结果 grounding 和 token 预算。</ns0:t>
       </ns0:r>
     </ns0:p>
     <ns0:p>
       <ns0:pPr>
-        <ns0:spacing ns0:after="120" ns0:line="276" ns0:lineRule="auto"/>
+        <ns0:spacing ns0:after="100" ns0:line="312" ns0:lineRule="auto" ns0:before="80"/>
       </ns0:pPr>
       <ns0:r>
         <ns0:rPr>
           <ns0:rFonts ns0:ascii="Arial" ns0:hAnsi="Arial" ns0:eastAsia="Microsoft YaHei"/>
+          <ns0:sz ns0:val="22"/>
+          <ns0:color ns0:val="111111"/>
         </ns0:rPr>
-        <ns0:t>Q: 和普通 BI 看板有什么区别？ A: 看板回答固定问题；QueryForge 支持围绕经营问题连续追问，并把问题落到 SQL、图表和结果解释上。</ns0:t>
+        <ns0:t>数据合规：典型用户分析自己的订单和商品数据；如果包含个人信息或平台限制字段，仍由使用者确认授权。</ns0:t>
       </ns0:r>
     </ns0:p>
     <ns0:p>
       <ns0:pPr>
-        <ns0:spacing ns0:after="120" ns0:line="276" ns0:lineRule="auto"/>
+        <ns0:spacing ns0:before="80" ns0:after="100" ns0:line="312" ns0:lineRule="auto"/>
       </ns0:pPr>
       <ns0:r>
         <ns0:rPr>
           <ns0:rFonts ns0:ascii="Arial" ns0:hAnsi="Arial" ns0:eastAsia="Microsoft YaHei"/>
+          <ns0:sz ns0:val="22"/>
+          <ns0:color ns0:val="111111"/>
         </ns0:rPr>
-        <ns0:t>Q: 和直接问大模型有什么区别？ A: 大模型默认没有数据库执行权、指标口径和查询记录。QueryForge 把模型放进本地 harness，让它看 schema、生成只读 SQL、执行查询，并基于真实结果回答。</ns0:t>
+        <ns0:t>商业化：闭源预编译软件包 + 官网/渠道/社群销售，模型 token 由用户自己的 provider key 承担。</ns0:t>
       </ns0:r>
     </ns0:p>
     <ns0:p>
       <ns0:pPr>
-        <ns0:spacing ns0:after="120" ns0:line="276" ns0:lineRule="auto"/>
+        <ns0:spacing ns0:after="100" ns0:line="312" ns0:lineRule="auto" ns0:before="80"/>
       </ns0:pPr>
       <ns0:r>
         <ns0:rPr>
           <ns0:rFonts ns0:ascii="Arial" ns0:hAnsi="Arial" ns0:eastAsia="Microsoft YaHei"/>
+          <ns0:sz ns0:val="22"/>
+          <ns0:color ns0:val="111111"/>
         </ns0:rPr>
-        <ns0:t>Q: 数据真实吗？ A: 是 Kaggle Olist 公开电商数据集，约 10 万笔真实匿名商业订单。它是 demo case，不限制产品只能做巴西或电商数据。</ns0:t>
-      </ns0:r>
-    </ns0:p>
-    <ns0:p>
-      <ns0:pPr>
-        <ns0:spacing ns0:after="120" ns0:line="276" ns0:lineRule="auto"/>
-      </ns0:pPr>
-      <ns0:r>
-        <ns0:rPr>
-          <ns0:rFonts ns0:ascii="Arial" ns0:hAnsi="Arial" ns0:eastAsia="Microsoft YaHei"/>
-        </ns0:rPr>
-        <ns0:t>Q: 大模型幻觉怎么办？ A: 不让模型成为权威。它生成候选 SQL，系统用 schema、AST 只读校验、数据库执行结果和二次解释约束它。</ns0:t>
-      </ns0:r>
-    </ns0:p>
-    <ns0:p>
-      <ns0:pPr>
-        <ns0:spacing ns0:after="120" ns0:line="276" ns0:lineRule="auto"/>
-      </ns0:pPr>
-      <ns0:r>
-        <ns0:rPr>
-          <ns0:rFonts ns0:ascii="Arial" ns0:hAnsi="Arial" ns0:eastAsia="Microsoft YaHei"/>
-        </ns0:rPr>
-        <ns0:t>Q: 怎么商业化？ A: 更现实的是一次性买断小工具，首发价格带 128 到 168 元。目标用户是跨境电商小团队、平台卖家、外贸 SOHO 和广交会参展商，模型 token 由用户自己的 provider key 承担。</ns0:t>
-      </ns0:r>
-    </ns0:p>
-    <ns0:p>
-      <ns0:r>
-        <ns0:rPr>
-          <ns0:rFonts ns0:ascii="Arial" ns0:hAnsi="Arial" ns0:eastAsia="Microsoft YaHei"/>
-          <ns0:b/>
-        </ns0:rPr>
-        <ns0:t>措辞参考：Kaggle/Olist 数据集说明；Gartner Data &amp; Analytics；Tableau modern BI；IBM self-service analytics；Dun &amp; Bradstreet trusted business data；公开报道中的广交会跨境电商展区和中小微卖家生态。</ns0:t>
+        <ns0:t>平台范围：当前是 macOS demo，不写死平台；产品可以扩展到 Windows/macOS 桌面包。</ns0:t>
       </ns0:r>
     </ns0:p>
     <ns0:sectPr ns0:rsidR="00FC693F" ns0:rsidRPr="0006063C" ns0:rsidSect="00034616">

</xml_diff>